<commit_message>
Add simulation test data and update thermal guide
Test data from local simulation runs (sub-1111 through sub-1133)
used to verify the two-half run structure and GUI changes.
</commit_message>
<xml_diff>
--- a/fMRI_triangular_wave/thermal/docs/thermal_simulation_guide.docx
+++ b/fMRI_triangular_wave/thermal/docs/thermal_simulation_guide.docx
@@ -4,49 +4,126 @@
   <w:body>
     <w:p>
       <w:pPr>
-        <w:pStyle w:val="Title"/>
-        <w:spacing w:after="0"/>
+        <w:pStyle w:val="Heading1"/>
+        <w:spacing w:before="0"/>
         <w:jc w:val="center"/>
         <w:rPr>
-          <w:b/>
-          <w:bCs/>
+          <w:color w:val="002060"/>
+          <w:sz w:val="44"/>
+          <w:szCs w:val="44"/>
         </w:rPr>
       </w:pPr>
       <w:r>
         <w:rPr>
-          <w:b/>
-          <w:bCs/>
+          <w:color w:val="002060"/>
+          <w:sz w:val="44"/>
+          <w:szCs w:val="44"/>
         </w:rPr>
         <w:t xml:space="preserve">Thermal </w:t>
       </w:r>
       <w:proofErr w:type="spellStart"/>
       <w:r>
         <w:rPr>
-          <w:b/>
-          <w:bCs/>
+          <w:color w:val="002060"/>
+          <w:sz w:val="44"/>
+          <w:szCs w:val="44"/>
         </w:rPr>
         <w:t>pRF</w:t>
       </w:r>
       <w:proofErr w:type="spellEnd"/>
       <w:r>
         <w:rPr>
-          <w:b/>
-          <w:bCs/>
+          <w:color w:val="002060"/>
+          <w:sz w:val="44"/>
+          <w:szCs w:val="44"/>
         </w:rPr>
-        <w:t xml:space="preserve"> Experiment</w:t>
+        <w:t xml:space="preserve"> experiment</w:t>
       </w:r>
     </w:p>
     <w:p>
       <w:pPr>
         <w:pStyle w:val="Heading1"/>
+        <w:spacing w:before="0"/>
       </w:pPr>
       <w:r>
         <w:t>Open your terminal</w:t>
       </w:r>
     </w:p>
+    <w:tbl>
+      <w:tblPr>
+        <w:tblStyle w:val="TableGrid"/>
+        <w:tblW w:w="0" w:type="auto"/>
+        <w:tblLook w:val="04A0" w:firstRow="1" w:lastRow="0" w:firstColumn="1" w:lastColumn="0" w:noHBand="0" w:noVBand="1"/>
+      </w:tblPr>
+      <w:tblGrid>
+        <w:gridCol w:w="3794"/>
+        <w:gridCol w:w="5062"/>
+      </w:tblGrid>
+      <w:tr>
+        <w:tc>
+          <w:tcPr>
+            <w:tcW w:w="3794" w:type="dxa"/>
+          </w:tcPr>
+          <w:p>
+            <w:pPr>
+              <w:rPr>
+                <w:b/>
+                <w:bCs/>
+                <w:highlight w:val="green"/>
+              </w:rPr>
+            </w:pPr>
+            <w:proofErr w:type="spellStart"/>
+            <w:r>
+              <w:rPr>
+                <w:b/>
+                <w:bCs/>
+                <w:highlight w:val="green"/>
+              </w:rPr>
+              <w:t>conda</w:t>
+            </w:r>
+            <w:proofErr w:type="spellEnd"/>
+            <w:r>
+              <w:rPr>
+                <w:b/>
+                <w:bCs/>
+                <w:highlight w:val="green"/>
+              </w:rPr>
+              <w:t xml:space="preserve"> activate </w:t>
+            </w:r>
+            <w:proofErr w:type="spellStart"/>
+            <w:r>
+              <w:rPr>
+                <w:b/>
+                <w:bCs/>
+                <w:highlight w:val="green"/>
+              </w:rPr>
+              <w:t>psychopy</w:t>
+            </w:r>
+            <w:proofErr w:type="spellEnd"/>
+          </w:p>
+        </w:tc>
+        <w:tc>
+          <w:tcPr>
+            <w:tcW w:w="5062" w:type="dxa"/>
+          </w:tcPr>
+          <w:p>
+            <w:r>
+              <w:t>Depending on your local setup</w:t>
+            </w:r>
+          </w:p>
+        </w:tc>
+      </w:tr>
+    </w:tbl>
     <w:p>
       <w:pPr>
         <w:pStyle w:val="Heading1"/>
+        <w:spacing w:before="0"/>
+      </w:pPr>
+    </w:p>
+    <w:p>
+      <w:pPr>
+        <w:pStyle w:val="Heading1"/>
+        <w:spacing w:before="0"/>
       </w:pPr>
       <w:r>
         <w:t>Initial checks via scripts</w:t>
@@ -175,6 +252,13 @@
     <w:p>
       <w:pPr>
         <w:pStyle w:val="Heading1"/>
+        <w:spacing w:before="0"/>
+      </w:pPr>
+    </w:p>
+    <w:p>
+      <w:pPr>
+        <w:pStyle w:val="Heading1"/>
+        <w:spacing w:before="0"/>
       </w:pPr>
       <w:r>
         <w:t>Individual checks</w:t>
@@ -202,7 +286,7 @@
                 <w:b/>
                 <w:sz w:val="20"/>
               </w:rPr>
-              <w:t>python3 --version</w:t>
+              <w:t>python --version</w:t>
             </w:r>
             <w:r>
               <w:t xml:space="preserve">    </w:t>
@@ -239,7 +323,7 @@
                 <w:bCs/>
                 <w:sz w:val="20"/>
               </w:rPr>
-              <w:t xml:space="preserve">python3 -c "import </w:t>
+              <w:t xml:space="preserve">python -c "import </w:t>
             </w:r>
             <w:proofErr w:type="spellStart"/>
             <w:r>
@@ -309,29 +393,8 @@
             </w:r>
             <w:proofErr w:type="spellEnd"/>
             <w:r>
-              <w:t xml:space="preserve"> is installed.</w:t>
+              <w:t xml:space="preserve"> is installed</w:t>
             </w:r>
-          </w:p>
-          <w:p>
-            <w:r>
-              <w:t xml:space="preserve">If not: </w:t>
-            </w:r>
-            <w:r>
-              <w:rPr>
-                <w:rFonts w:ascii="Consolas" w:hAnsi="Consolas"/>
-                <w:sz w:val="20"/>
-              </w:rPr>
-              <w:t xml:space="preserve">pip3 install </w:t>
-            </w:r>
-            <w:proofErr w:type="spellStart"/>
-            <w:r>
-              <w:rPr>
-                <w:rFonts w:ascii="Consolas" w:hAnsi="Consolas"/>
-                <w:sz w:val="20"/>
-              </w:rPr>
-              <w:t>psychopy</w:t>
-            </w:r>
-            <w:proofErr w:type="spellEnd"/>
           </w:p>
         </w:tc>
       </w:tr>
@@ -354,7 +417,7 @@
                 <w:bCs/>
                 <w:sz w:val="20"/>
               </w:rPr>
-              <w:t xml:space="preserve">python3 -c "import </w:t>
+              <w:t xml:space="preserve">python -c "import </w:t>
             </w:r>
             <w:proofErr w:type="spellStart"/>
             <w:r>
@@ -407,36 +470,19 @@
               <w:t>Check other dependencies.</w:t>
             </w:r>
           </w:p>
-          <w:p>
-            <w:r>
-              <w:t xml:space="preserve">If not: </w:t>
-            </w:r>
-            <w:r>
-              <w:t xml:space="preserve">pip3 install </w:t>
-            </w:r>
-            <w:proofErr w:type="spellStart"/>
-            <w:r>
-              <w:t>numpy</w:t>
-            </w:r>
-            <w:proofErr w:type="spellEnd"/>
-            <w:r>
-              <w:t xml:space="preserve"> </w:t>
-            </w:r>
-            <w:proofErr w:type="spellStart"/>
-            <w:r>
-              <w:t>scipy</w:t>
-            </w:r>
-            <w:proofErr w:type="spellEnd"/>
-            <w:r>
-              <w:t xml:space="preserve"> matplotlib</w:t>
-            </w:r>
-          </w:p>
         </w:tc>
       </w:tr>
     </w:tbl>
     <w:p>
       <w:pPr>
         <w:pStyle w:val="Heading1"/>
+        <w:spacing w:before="0"/>
+      </w:pPr>
+    </w:p>
+    <w:p>
+      <w:pPr>
+        <w:pStyle w:val="Heading1"/>
+        <w:spacing w:before="0"/>
       </w:pPr>
       <w:r>
         <w:t>Run the experiment</w:t>
@@ -472,7 +518,7 @@
                 <w:sz w:val="20"/>
                 <w:highlight w:val="green"/>
               </w:rPr>
-              <w:t>python3 run_experiment.py</w:t>
+              <w:t>python run_experiment.py</w:t>
             </w:r>
           </w:p>
         </w:tc>
@@ -505,8 +551,9 @@
                 <w:b/>
                 <w:bCs/>
                 <w:sz w:val="20"/>
+                <w:highlight w:val="cyan"/>
               </w:rPr>
-              <w:t>python3 qc_monitor.py</w:t>
+              <w:t>python qc_monitor.py</w:t>
             </w:r>
           </w:p>
         </w:tc>
@@ -542,8 +589,9 @@
                 <w:b/>
                 <w:bCs/>
                 <w:sz w:val="20"/>
+                <w:highlight w:val="magenta"/>
               </w:rPr>
-              <w:t>python3 thermode_precheck.py</w:t>
+              <w:t>python thermode_precheck.py</w:t>
             </w:r>
           </w:p>
         </w:tc>
@@ -558,10 +606,57 @@
           </w:p>
         </w:tc>
       </w:tr>
+      <w:tr>
+        <w:tc>
+          <w:tcPr>
+            <w:tcW w:w="3794" w:type="dxa"/>
+          </w:tcPr>
+          <w:p>
+            <w:pPr>
+              <w:rPr>
+                <w:rFonts w:ascii="Consolas" w:hAnsi="Consolas"/>
+                <w:b/>
+                <w:bCs/>
+                <w:sz w:val="20"/>
+              </w:rPr>
+            </w:pPr>
+            <w:r>
+              <w:rPr>
+                <w:rFonts w:ascii="Consolas" w:hAnsi="Consolas"/>
+                <w:b/>
+                <w:bCs/>
+                <w:sz w:val="20"/>
+                <w:highlight w:val="yellow"/>
+              </w:rPr>
+              <w:t>python run_single_half.py</w:t>
+            </w:r>
+          </w:p>
+        </w:tc>
+        <w:tc>
+          <w:tcPr>
+            <w:tcW w:w="5062" w:type="dxa"/>
+          </w:tcPr>
+          <w:p>
+            <w:r>
+              <w:t>Run half a block (12 cycles)</w:t>
+            </w:r>
+            <w:r>
+              <w:t>; in case of crashes</w:t>
+            </w:r>
+          </w:p>
+        </w:tc>
+      </w:tr>
     </w:tbl>
     <w:p>
       <w:pPr>
         <w:pStyle w:val="Heading1"/>
+        <w:spacing w:before="0"/>
+      </w:pPr>
+    </w:p>
+    <w:p>
+      <w:pPr>
+        <w:pStyle w:val="Heading1"/>
+        <w:spacing w:before="0"/>
       </w:pPr>
       <w:r>
         <w:t>After launching the experiment, set up the GUI</w:t>
@@ -574,13 +669,13 @@
         <w:tblLook w:val="04A0" w:firstRow="1" w:lastRow="0" w:firstColumn="1" w:lastColumn="0" w:noHBand="0" w:noVBand="1"/>
       </w:tblPr>
       <w:tblGrid>
-        <w:gridCol w:w="3794"/>
-        <w:gridCol w:w="5062"/>
+        <w:gridCol w:w="2235"/>
+        <w:gridCol w:w="6621"/>
       </w:tblGrid>
       <w:tr>
         <w:tc>
           <w:tcPr>
-            <w:tcW w:w="3794" w:type="dxa"/>
+            <w:tcW w:w="2235" w:type="dxa"/>
           </w:tcPr>
           <w:p>
             <w:pPr>
@@ -594,13 +689,20 @@
                 <w:b/>
                 <w:bCs/>
               </w:rPr>
-              <w:t>Block</w:t>
+              <w:t xml:space="preserve">Participant </w:t>
+            </w:r>
+            <w:r>
+              <w:rPr>
+                <w:b/>
+                <w:bCs/>
+              </w:rPr>
+              <w:t>ID</w:t>
             </w:r>
           </w:p>
         </w:tc>
         <w:tc>
           <w:tcPr>
-            <w:tcW w:w="5062" w:type="dxa"/>
+            <w:tcW w:w="6621" w:type="dxa"/>
           </w:tcPr>
           <w:p/>
         </w:tc>
@@ -608,7 +710,7 @@
       <w:tr>
         <w:tc>
           <w:tcPr>
-            <w:tcW w:w="3794" w:type="dxa"/>
+            <w:tcW w:w="2235" w:type="dxa"/>
           </w:tcPr>
           <w:p>
             <w:pPr>
@@ -622,13 +724,13 @@
                 <w:b/>
                 <w:bCs/>
               </w:rPr>
-              <w:t>Port</w:t>
+              <w:t>Session number</w:t>
             </w:r>
           </w:p>
         </w:tc>
         <w:tc>
           <w:tcPr>
-            <w:tcW w:w="5062" w:type="dxa"/>
+            <w:tcW w:w="6621" w:type="dxa"/>
           </w:tcPr>
           <w:p/>
         </w:tc>
@@ -636,7 +738,142 @@
       <w:tr>
         <w:tc>
           <w:tcPr>
-            <w:tcW w:w="3794" w:type="dxa"/>
+            <w:tcW w:w="2235" w:type="dxa"/>
+          </w:tcPr>
+          <w:p>
+            <w:pPr>
+              <w:rPr>
+                <w:b/>
+                <w:bCs/>
+              </w:rPr>
+            </w:pPr>
+            <w:r>
+              <w:rPr>
+                <w:b/>
+                <w:bCs/>
+              </w:rPr>
+              <w:t>Run</w:t>
+            </w:r>
+            <w:r>
+              <w:rPr>
+                <w:b/>
+                <w:bCs/>
+              </w:rPr>
+              <w:t xml:space="preserve"> number</w:t>
+            </w:r>
+          </w:p>
+        </w:tc>
+        <w:tc>
+          <w:tcPr>
+            <w:tcW w:w="6621" w:type="dxa"/>
+          </w:tcPr>
+          <w:p>
+            <w:r>
+              <w:t>Pick one of 4 runs</w:t>
+            </w:r>
+          </w:p>
+        </w:tc>
+      </w:tr>
+      <w:tr>
+        <w:tc>
+          <w:tcPr>
+            <w:tcW w:w="2235" w:type="dxa"/>
+          </w:tcPr>
+          <w:p>
+            <w:pPr>
+              <w:rPr>
+                <w:b/>
+                <w:bCs/>
+              </w:rPr>
+            </w:pPr>
+            <w:r>
+              <w:rPr>
+                <w:b/>
+                <w:bCs/>
+              </w:rPr>
+              <w:t>Max delta</w:t>
+            </w:r>
+          </w:p>
+        </w:tc>
+        <w:tc>
+          <w:tcPr>
+            <w:tcW w:w="6621" w:type="dxa"/>
+          </w:tcPr>
+          <w:p>
+            <w:r>
+              <w:t>Min/max deviation from baseline</w:t>
+            </w:r>
+          </w:p>
+        </w:tc>
+      </w:tr>
+      <w:tr>
+        <w:tc>
+          <w:tcPr>
+            <w:tcW w:w="2235" w:type="dxa"/>
+          </w:tcPr>
+          <w:p>
+            <w:pPr>
+              <w:rPr>
+                <w:b/>
+                <w:bCs/>
+              </w:rPr>
+            </w:pPr>
+            <w:r>
+              <w:rPr>
+                <w:b/>
+                <w:bCs/>
+              </w:rPr>
+              <w:t>Body site</w:t>
+            </w:r>
+          </w:p>
+        </w:tc>
+        <w:tc>
+          <w:tcPr>
+            <w:tcW w:w="6621" w:type="dxa"/>
+          </w:tcPr>
+          <w:p>
+            <w:r>
+              <w:t>Leg or arm</w:t>
+            </w:r>
+          </w:p>
+        </w:tc>
+      </w:tr>
+      <w:tr>
+        <w:tc>
+          <w:tcPr>
+            <w:tcW w:w="2235" w:type="dxa"/>
+          </w:tcPr>
+          <w:p>
+            <w:pPr>
+              <w:rPr>
+                <w:b/>
+                <w:bCs/>
+              </w:rPr>
+            </w:pPr>
+            <w:r>
+              <w:rPr>
+                <w:b/>
+                <w:bCs/>
+              </w:rPr>
+              <w:t>Serial port</w:t>
+            </w:r>
+          </w:p>
+        </w:tc>
+        <w:tc>
+          <w:tcPr>
+            <w:tcW w:w="6621" w:type="dxa"/>
+          </w:tcPr>
+          <w:p>
+            <w:r>
+              <w:t>Depending on the platform</w:t>
+            </w:r>
+          </w:p>
+        </w:tc>
+      </w:tr>
+      <w:tr>
+        <w:tc>
+          <w:tcPr>
+            <w:tcW w:w="2235" w:type="dxa"/>
           </w:tcPr>
           <w:p>
             <w:pPr>
@@ -656,17 +893,15 @@
         </w:tc>
         <w:tc>
           <w:tcPr>
-            <w:tcW w:w="5062" w:type="dxa"/>
+            <w:tcW w:w="6621" w:type="dxa"/>
           </w:tcPr>
           <w:p>
             <w:r>
               <w:t xml:space="preserve">True = if you </w:t>
             </w:r>
-            <w:proofErr w:type="gramStart"/>
             <w:r>
-              <w:t>testing</w:t>
+              <w:t>are testing</w:t>
             </w:r>
-            <w:proofErr w:type="gramEnd"/>
             <w:r>
               <w:t xml:space="preserve"> the scripts without the thermode</w:t>
             </w:r>
@@ -676,7 +911,7 @@
       <w:tr>
         <w:tc>
           <w:tcPr>
-            <w:tcW w:w="3794" w:type="dxa"/>
+            <w:tcW w:w="2235" w:type="dxa"/>
           </w:tcPr>
           <w:p>
             <w:pPr>
@@ -696,7 +931,7 @@
         </w:tc>
         <w:tc>
           <w:tcPr>
-            <w:tcW w:w="5062" w:type="dxa"/>
+            <w:tcW w:w="6621" w:type="dxa"/>
           </w:tcPr>
           <w:p>
             <w:r>
@@ -708,7 +943,7 @@
       <w:tr>
         <w:tc>
           <w:tcPr>
-            <w:tcW w:w="3794" w:type="dxa"/>
+            <w:tcW w:w="2235" w:type="dxa"/>
           </w:tcPr>
           <w:p>
             <w:pPr>
@@ -728,7 +963,7 @@
         </w:tc>
         <w:tc>
           <w:tcPr>
-            <w:tcW w:w="5062" w:type="dxa"/>
+            <w:tcW w:w="6621" w:type="dxa"/>
           </w:tcPr>
           <w:p>
             <w:r>
@@ -739,735 +974,443 @@
       </w:tr>
     </w:tbl>
     <w:p/>
-    <w:p/>
     <w:p>
-      <w:pPr>
-        <w:pStyle w:val="Heading2"/>
-      </w:pPr>
       <w:r>
-        <w:lastRenderedPageBreak/>
-        <w:t>Additional settings for Linux</w:t>
+        <w:br w:type="page"/>
       </w:r>
     </w:p>
     <w:p>
       <w:r>
-        <w:t>In config_v3.py, also change:</w:t>
+        <w:lastRenderedPageBreak/>
+        <w:t>Thresholding</w:t>
+      </w:r>
+    </w:p>
+    <w:p>
+      <w:r>
+        <w:t xml:space="preserve">In MATLAB, check whether </w:t>
+      </w:r>
+      <w:proofErr w:type="spellStart"/>
+      <w:r>
+        <w:t>PsychToolbox</w:t>
+      </w:r>
+      <w:proofErr w:type="spellEnd"/>
+      <w:r>
+        <w:t xml:space="preserve"> is installed by typing</w:t>
       </w:r>
     </w:p>
     <w:p>
       <w:pPr>
-        <w:pStyle w:val="ListBullet"/>
+        <w:pStyle w:val="ListParagraph"/>
+        <w:numPr>
+          <w:ilvl w:val="0"/>
+          <w:numId w:val="10"/>
+        </w:numPr>
       </w:pPr>
+      <w:proofErr w:type="spellStart"/>
       <w:r>
-        <w:rPr>
-          <w:rFonts w:ascii="Consolas" w:hAnsi="Consolas"/>
-          <w:sz w:val="20"/>
-        </w:rPr>
-        <w:t>com_port</w:t>
+        <w:t>PsychtoolboxVersion</w:t>
       </w:r>
+      <w:proofErr w:type="spellEnd"/>
       <w:r>
-        <w:t xml:space="preserve"> → '/dev/ttyACM0' (find yours with </w:t>
-      </w:r>
-      <w:r>
-        <w:rPr>
-          <w:rFonts w:ascii="Consolas" w:hAnsi="Consolas"/>
-          <w:sz w:val="20"/>
-        </w:rPr>
-        <w:t>ls /dev/ttyACM*</w:t>
-      </w:r>
-      <w:r>
-        <w:t>)</w:t>
+        <w:t xml:space="preserve">   </w:t>
       </w:r>
     </w:p>
     <w:p>
       <w:pPr>
-        <w:pStyle w:val="ListBullet"/>
+        <w:tabs>
+          <w:tab w:val="left" w:pos="560"/>
+          <w:tab w:val="left" w:pos="1120"/>
+          <w:tab w:val="left" w:pos="1680"/>
+          <w:tab w:val="left" w:pos="2240"/>
+          <w:tab w:val="left" w:pos="2800"/>
+          <w:tab w:val="left" w:pos="3360"/>
+          <w:tab w:val="left" w:pos="3920"/>
+          <w:tab w:val="left" w:pos="4480"/>
+          <w:tab w:val="left" w:pos="5040"/>
+          <w:tab w:val="left" w:pos="5600"/>
+          <w:tab w:val="left" w:pos="6160"/>
+          <w:tab w:val="left" w:pos="6720"/>
+        </w:tabs>
+        <w:autoSpaceDE w:val="0"/>
+        <w:autoSpaceDN w:val="0"/>
+        <w:adjustRightInd w:val="0"/>
+        <w:spacing w:after="0" w:line="240" w:lineRule="auto"/>
       </w:pPr>
       <w:r>
-        <w:rPr>
-          <w:rFonts w:ascii="Consolas" w:hAnsi="Consolas"/>
-          <w:sz w:val="20"/>
-        </w:rPr>
-        <w:t>trigger_mode</w:t>
-      </w:r>
-      <w:r>
-        <w:t xml:space="preserve"> → 'parallel' if the scanner sends triggers via parallel port (requires </w:t>
-      </w:r>
-      <w:r>
-        <w:rPr>
-          <w:rFonts w:ascii="Consolas" w:hAnsi="Consolas"/>
-          <w:sz w:val="20"/>
-        </w:rPr>
-        <w:t>pip3 install pyparallel</w:t>
-      </w:r>
-      <w:r>
-        <w:t>)</w:t>
+        <w:t>If it’s not installed, follow the instructions below</w:t>
       </w:r>
     </w:p>
     <w:p>
       <w:pPr>
-        <w:pStyle w:val="ListBullet"/>
+        <w:tabs>
+          <w:tab w:val="left" w:pos="560"/>
+          <w:tab w:val="left" w:pos="1120"/>
+          <w:tab w:val="left" w:pos="1680"/>
+          <w:tab w:val="left" w:pos="2240"/>
+          <w:tab w:val="left" w:pos="2800"/>
+          <w:tab w:val="left" w:pos="3360"/>
+          <w:tab w:val="left" w:pos="3920"/>
+          <w:tab w:val="left" w:pos="4480"/>
+          <w:tab w:val="left" w:pos="5040"/>
+          <w:tab w:val="left" w:pos="5600"/>
+          <w:tab w:val="left" w:pos="6160"/>
+          <w:tab w:val="left" w:pos="6720"/>
+        </w:tabs>
+        <w:autoSpaceDE w:val="0"/>
+        <w:autoSpaceDN w:val="0"/>
+        <w:adjustRightInd w:val="0"/>
+        <w:spacing w:after="0" w:line="240" w:lineRule="auto"/>
       </w:pPr>
       <w:r>
-        <w:rPr>
-          <w:rFonts w:ascii="Consolas" w:hAnsi="Consolas"/>
-          <w:sz w:val="20"/>
-        </w:rPr>
-        <w:t>tcs_filter</w:t>
-      </w:r>
-      <w:r>
-        <w:t xml:space="preserve"> → 'medium' if the TCS has an MRI cable filter installed</w:t>
-      </w:r>
-    </w:p>
-    <w:p>
-      <w:r>
-        <w:t xml:space="preserve">If you get a serial port permission error, add your user to the dialout group: </w:t>
+        <w:br/>
       </w:r>
       <w:r>
         <w:rPr>
-          <w:rFonts w:ascii="Consolas" w:hAnsi="Consolas"/>
-          <w:sz w:val="20"/>
+          <w:rFonts w:ascii="Apple Color Emoji" w:hAnsi="Apple Color Emoji" w:cs="Apple Color Emoji"/>
         </w:rPr>
-        <w:t>sudo usermod -aG dialout $USER</w:t>
+        <w:t>⏺</w:t>
       </w:r>
       <w:r>
-        <w:t>, then log out and back in.</w:t>
+        <w:t xml:space="preserve"> In MATLAB, run:                                                                                                       </w:t>
       </w:r>
     </w:p>
     <w:p>
       <w:pPr>
-        <w:pStyle w:val="Heading1"/>
+        <w:tabs>
+          <w:tab w:val="left" w:pos="560"/>
+          <w:tab w:val="left" w:pos="1120"/>
+          <w:tab w:val="left" w:pos="1680"/>
+          <w:tab w:val="left" w:pos="2240"/>
+          <w:tab w:val="left" w:pos="2800"/>
+          <w:tab w:val="left" w:pos="3360"/>
+          <w:tab w:val="left" w:pos="3920"/>
+          <w:tab w:val="left" w:pos="4480"/>
+          <w:tab w:val="left" w:pos="5040"/>
+          <w:tab w:val="left" w:pos="5600"/>
+          <w:tab w:val="left" w:pos="6160"/>
+          <w:tab w:val="left" w:pos="6720"/>
+        </w:tabs>
+        <w:autoSpaceDE w:val="0"/>
+        <w:autoSpaceDN w:val="0"/>
+        <w:adjustRightInd w:val="0"/>
+        <w:spacing w:after="0" w:line="240" w:lineRule="auto"/>
       </w:pPr>
       <w:r>
-        <w:t>3. Running the experiment</w:t>
+        <w:t xml:space="preserve">                                         </w:t>
       </w:r>
     </w:p>
     <w:p>
       <w:pPr>
-        <w:pStyle w:val="Heading2"/>
+        <w:tabs>
+          <w:tab w:val="left" w:pos="560"/>
+          <w:tab w:val="left" w:pos="1120"/>
+          <w:tab w:val="left" w:pos="1680"/>
+          <w:tab w:val="left" w:pos="2240"/>
+          <w:tab w:val="left" w:pos="2800"/>
+          <w:tab w:val="left" w:pos="3360"/>
+          <w:tab w:val="left" w:pos="3920"/>
+          <w:tab w:val="left" w:pos="4480"/>
+          <w:tab w:val="left" w:pos="5040"/>
+          <w:tab w:val="left" w:pos="5600"/>
+          <w:tab w:val="left" w:pos="6160"/>
+          <w:tab w:val="left" w:pos="6720"/>
+        </w:tabs>
+        <w:autoSpaceDE w:val="0"/>
+        <w:autoSpaceDN w:val="0"/>
+        <w:adjustRightInd w:val="0"/>
+        <w:spacing w:after="0" w:line="240" w:lineRule="auto"/>
       </w:pPr>
       <w:r>
-        <w:t>3.1 Navigate to the thermal folder</w:t>
+        <w:t xml:space="preserve">  cd(</w:t>
       </w:r>
-    </w:p>
-    <w:p>
+      <w:proofErr w:type="spellStart"/>
       <w:r>
-        <w:rPr>
-          <w:rFonts w:ascii="Consolas" w:hAnsi="Consolas"/>
-          <w:sz w:val="20"/>
-        </w:rPr>
-        <w:t>cd fMRI_triangular_wave/thermal</w:t>
+        <w:t>tempdir</w:t>
+      </w:r>
+      <w:proofErr w:type="spellEnd"/>
+      <w:r>
+        <w:t xml:space="preserve">);                                                                                                          </w:t>
       </w:r>
     </w:p>
     <w:p>
       <w:pPr>
-        <w:pStyle w:val="Heading2"/>
+        <w:tabs>
+          <w:tab w:val="left" w:pos="560"/>
+          <w:tab w:val="left" w:pos="1120"/>
+          <w:tab w:val="left" w:pos="1680"/>
+          <w:tab w:val="left" w:pos="2240"/>
+          <w:tab w:val="left" w:pos="2800"/>
+          <w:tab w:val="left" w:pos="3360"/>
+          <w:tab w:val="left" w:pos="3920"/>
+          <w:tab w:val="left" w:pos="4480"/>
+          <w:tab w:val="left" w:pos="5040"/>
+          <w:tab w:val="left" w:pos="5600"/>
+          <w:tab w:val="left" w:pos="6160"/>
+          <w:tab w:val="left" w:pos="6720"/>
+        </w:tabs>
+        <w:autoSpaceDE w:val="0"/>
+        <w:autoSpaceDN w:val="0"/>
+        <w:adjustRightInd w:val="0"/>
+        <w:spacing w:after="0" w:line="240" w:lineRule="auto"/>
       </w:pPr>
       <w:r>
-        <w:t>3.2 Run the thermode pre-check (optional)</w:t>
+        <w:t xml:space="preserve">  </w:t>
       </w:r>
-    </w:p>
-    <w:p>
+      <w:proofErr w:type="gramStart"/>
       <w:r>
-        <w:t xml:space="preserve">This runs a short ramp to verify </w:t>
+        <w:t>urlwrite(</w:t>
       </w:r>
+      <w:proofErr w:type="gramEnd"/>
       <w:r>
-        <w:t>that the thermode is responsive (e.g., before attaching the thermode to the participants, or to check that the thermode has recovered after overheating</w:t>
-      </w:r>
-      <w:r>
-        <w:t xml:space="preserve">. </w:t>
-      </w:r>
-    </w:p>
-    <w:p>
-      <w:r>
-        <w:rPr>
-          <w:rFonts w:ascii="Consolas" w:hAnsi="Consolas"/>
-          <w:sz w:val="20"/>
-        </w:rPr>
-        <w:t>python3 thermode_precheck.py</w:t>
-      </w:r>
-    </w:p>
-    <w:p>
-      <w:r>
-        <w:t>Output: a JSON report saved to thermal/data/.</w:t>
+        <w:t>'https://raw.githubusercontent.com/Psychtoolbox-3/Psychtoolbox-3/master/Psychtoolbox/DownloadPsychtoolbox.m',</w:t>
       </w:r>
     </w:p>
     <w:p>
       <w:pPr>
-        <w:pStyle w:val="Heading2"/>
+        <w:tabs>
+          <w:tab w:val="left" w:pos="560"/>
+          <w:tab w:val="left" w:pos="1120"/>
+          <w:tab w:val="left" w:pos="1680"/>
+          <w:tab w:val="left" w:pos="2240"/>
+          <w:tab w:val="left" w:pos="2800"/>
+          <w:tab w:val="left" w:pos="3360"/>
+          <w:tab w:val="left" w:pos="3920"/>
+          <w:tab w:val="left" w:pos="4480"/>
+          <w:tab w:val="left" w:pos="5040"/>
+          <w:tab w:val="left" w:pos="5600"/>
+          <w:tab w:val="left" w:pos="6160"/>
+          <w:tab w:val="left" w:pos="6720"/>
+        </w:tabs>
+        <w:autoSpaceDE w:val="0"/>
+        <w:autoSpaceDN w:val="0"/>
+        <w:adjustRightInd w:val="0"/>
+        <w:spacing w:after="0" w:line="240" w:lineRule="auto"/>
       </w:pPr>
       <w:r>
-        <w:t>3.3 Run a block</w:t>
+        <w:t xml:space="preserve">   '</w:t>
       </w:r>
-    </w:p>
-    <w:p>
+      <w:proofErr w:type="spellStart"/>
       <w:r>
-        <w:rPr>
-          <w:rFonts w:ascii="Consolas" w:hAnsi="Consolas"/>
-          <w:sz w:val="20"/>
-        </w:rPr>
-        <w:t>python3 run_experiment.py</w:t>
+        <w:t>DownloadPsychtoolbox.m</w:t>
+      </w:r>
+      <w:proofErr w:type="spellEnd"/>
+      <w:r>
+        <w:t xml:space="preserve">'); </w:t>
+      </w:r>
+      <w:proofErr w:type="spellStart"/>
+      <w:proofErr w:type="gramStart"/>
+      <w:r>
+        <w:t>DownloadPsychtoolbox</w:t>
+      </w:r>
+      <w:proofErr w:type="spellEnd"/>
+      <w:r>
+        <w:t>(</w:t>
+      </w:r>
+      <w:proofErr w:type="spellStart"/>
+      <w:r>
+        <w:t>fullfile</w:t>
+      </w:r>
+      <w:proofErr w:type="spellEnd"/>
+      <w:r>
+        <w:t>(</w:t>
+      </w:r>
+      <w:proofErr w:type="spellStart"/>
+      <w:proofErr w:type="gramEnd"/>
+      <w:r>
+        <w:t>userpath</w:t>
+      </w:r>
+      <w:proofErr w:type="spellEnd"/>
+      <w:r>
+        <w:t>, '</w:t>
+      </w:r>
+      <w:proofErr w:type="spellStart"/>
+      <w:r>
+        <w:t>Psychtoolbox</w:t>
+      </w:r>
+      <w:proofErr w:type="spellEnd"/>
+      <w:r>
+        <w:t xml:space="preserve">'))                                  </w:t>
       </w:r>
     </w:p>
     <w:p>
       <w:pPr>
-        <w:pStyle w:val="Heading2"/>
+        <w:tabs>
+          <w:tab w:val="left" w:pos="560"/>
+          <w:tab w:val="left" w:pos="1120"/>
+          <w:tab w:val="left" w:pos="1680"/>
+          <w:tab w:val="left" w:pos="2240"/>
+          <w:tab w:val="left" w:pos="2800"/>
+          <w:tab w:val="left" w:pos="3360"/>
+          <w:tab w:val="left" w:pos="3920"/>
+          <w:tab w:val="left" w:pos="4480"/>
+          <w:tab w:val="left" w:pos="5040"/>
+          <w:tab w:val="left" w:pos="5600"/>
+          <w:tab w:val="left" w:pos="6160"/>
+          <w:tab w:val="left" w:pos="6720"/>
+        </w:tabs>
+        <w:autoSpaceDE w:val="0"/>
+        <w:autoSpaceDN w:val="0"/>
+        <w:adjustRightInd w:val="0"/>
+        <w:spacing w:after="0" w:line="240" w:lineRule="auto"/>
       </w:pPr>
       <w:r>
-        <w:t>3.</w:t>
-      </w:r>
-      <w:r>
-        <w:t>4</w:t>
-      </w:r>
-      <w:r>
-        <w:t xml:space="preserve"> Live QC dashboard (optional)</w:t>
-      </w:r>
-    </w:p>
-    <w:p>
-      <w:r>
-        <w:t>In a separate terminal, while the experiment is running:</w:t>
-      </w:r>
-    </w:p>
-    <w:p>
-      <w:r>
-        <w:rPr>
-          <w:rFonts w:ascii="Consolas" w:hAnsi="Consolas"/>
-          <w:sz w:val="20"/>
-        </w:rPr>
-        <w:t>python3 qc_monitor.py</w:t>
-      </w:r>
-    </w:p>
-    <w:p>
-      <w:r>
-        <w:t>This opens a live matplotlib plot showing zone temperatures and tracking error. In simulation mode it displays the simulated values.</w:t>
+        <w:t xml:space="preserve">                                                                                                                        </w:t>
       </w:r>
     </w:p>
     <w:p>
       <w:pPr>
-        <w:pStyle w:val="Heading1"/>
+        <w:tabs>
+          <w:tab w:val="left" w:pos="560"/>
+          <w:tab w:val="left" w:pos="1120"/>
+          <w:tab w:val="left" w:pos="1680"/>
+          <w:tab w:val="left" w:pos="2240"/>
+          <w:tab w:val="left" w:pos="2800"/>
+          <w:tab w:val="left" w:pos="3360"/>
+          <w:tab w:val="left" w:pos="3920"/>
+          <w:tab w:val="left" w:pos="4480"/>
+          <w:tab w:val="left" w:pos="5040"/>
+          <w:tab w:val="left" w:pos="5600"/>
+          <w:tab w:val="left" w:pos="6160"/>
+          <w:tab w:val="left" w:pos="6720"/>
+        </w:tabs>
+        <w:autoSpaceDE w:val="0"/>
+        <w:autoSpaceDN w:val="0"/>
+        <w:adjustRightInd w:val="0"/>
+        <w:spacing w:after="0" w:line="240" w:lineRule="auto"/>
       </w:pPr>
       <w:r>
-        <w:t>4. Output files</w:t>
+        <w:t xml:space="preserve">  This downloads and installs </w:t>
       </w:r>
-    </w:p>
-    <w:p>
+      <w:proofErr w:type="spellStart"/>
       <w:r>
-        <w:t>Each block produces four files in thermal/data/sub-&lt;ID&gt;/ses-&lt;session&gt;/func/:</w:t>
+        <w:t>Psychtoolbox</w:t>
+      </w:r>
+      <w:proofErr w:type="spellEnd"/>
+      <w:r>
+        <w:t xml:space="preserve"> into your MATLAB </w:t>
+      </w:r>
+      <w:proofErr w:type="spellStart"/>
+      <w:r>
+        <w:t>userpath</w:t>
+      </w:r>
+      <w:proofErr w:type="spellEnd"/>
+      <w:r>
+        <w:t>. Follow any prompts that appear.</w:t>
       </w:r>
     </w:p>
     <w:p>
       <w:pPr>
-        <w:pStyle w:val="ListBullet"/>
+        <w:tabs>
+          <w:tab w:val="left" w:pos="560"/>
+          <w:tab w:val="left" w:pos="1120"/>
+          <w:tab w:val="left" w:pos="1680"/>
+          <w:tab w:val="left" w:pos="2240"/>
+          <w:tab w:val="left" w:pos="2800"/>
+          <w:tab w:val="left" w:pos="3360"/>
+          <w:tab w:val="left" w:pos="3920"/>
+          <w:tab w:val="left" w:pos="4480"/>
+          <w:tab w:val="left" w:pos="5040"/>
+          <w:tab w:val="left" w:pos="5600"/>
+          <w:tab w:val="left" w:pos="6160"/>
+          <w:tab w:val="left" w:pos="6720"/>
+        </w:tabs>
+        <w:autoSpaceDE w:val="0"/>
+        <w:autoSpaceDN w:val="0"/>
+        <w:adjustRightInd w:val="0"/>
+        <w:spacing w:after="0" w:line="240" w:lineRule="auto"/>
+      </w:pPr>
+    </w:p>
+    <w:p>
+      <w:pPr>
+        <w:tabs>
+          <w:tab w:val="left" w:pos="560"/>
+          <w:tab w:val="left" w:pos="1120"/>
+          <w:tab w:val="left" w:pos="1680"/>
+          <w:tab w:val="left" w:pos="2240"/>
+          <w:tab w:val="left" w:pos="2800"/>
+          <w:tab w:val="left" w:pos="3360"/>
+          <w:tab w:val="left" w:pos="3920"/>
+          <w:tab w:val="left" w:pos="4480"/>
+          <w:tab w:val="left" w:pos="5040"/>
+          <w:tab w:val="left" w:pos="5600"/>
+          <w:tab w:val="left" w:pos="6160"/>
+          <w:tab w:val="left" w:pos="6720"/>
+        </w:tabs>
+        <w:autoSpaceDE w:val="0"/>
+        <w:autoSpaceDN w:val="0"/>
+        <w:adjustRightInd w:val="0"/>
+        <w:spacing w:after="0" w:line="240" w:lineRule="auto"/>
       </w:pPr>
       <w:r>
-        <w:rPr>
-          <w:rFonts w:ascii="Consolas" w:hAnsi="Consolas"/>
-          <w:sz w:val="20"/>
-        </w:rPr>
-        <w:t>_events_&lt;timestamp&gt;.tsv</w:t>
-      </w:r>
-      <w:r>
-        <w:t xml:space="preserve"> — Block phases and VAS ratings</w:t>
+        <w:t xml:space="preserve">  Prerequisites (macOS):                                                                                                </w:t>
       </w:r>
     </w:p>
     <w:p>
       <w:pPr>
-        <w:pStyle w:val="ListBullet"/>
+        <w:tabs>
+          <w:tab w:val="left" w:pos="560"/>
+          <w:tab w:val="left" w:pos="1120"/>
+          <w:tab w:val="left" w:pos="1680"/>
+          <w:tab w:val="left" w:pos="2240"/>
+          <w:tab w:val="left" w:pos="2800"/>
+          <w:tab w:val="left" w:pos="3360"/>
+          <w:tab w:val="left" w:pos="3920"/>
+          <w:tab w:val="left" w:pos="4480"/>
+          <w:tab w:val="left" w:pos="5040"/>
+          <w:tab w:val="left" w:pos="5600"/>
+          <w:tab w:val="left" w:pos="6160"/>
+          <w:tab w:val="left" w:pos="6720"/>
+        </w:tabs>
+        <w:autoSpaceDE w:val="0"/>
+        <w:autoSpaceDN w:val="0"/>
+        <w:adjustRightInd w:val="0"/>
+        <w:spacing w:after="0" w:line="240" w:lineRule="auto"/>
       </w:pPr>
       <w:r>
-        <w:rPr>
-          <w:rFonts w:ascii="Consolas" w:hAnsi="Consolas"/>
-          <w:sz w:val="20"/>
-        </w:rPr>
-        <w:t>_thermode_&lt;timestamp&gt;.tsv</w:t>
+        <w:t xml:space="preserve">  - Xcode Command Line Tools: </w:t>
       </w:r>
+      <w:proofErr w:type="spellStart"/>
       <w:r>
-        <w:t xml:space="preserve"> — 10 Hz thermode recording (zone temperatures)</w:t>
+        <w:t>xcode</w:t>
+      </w:r>
+      <w:proofErr w:type="spellEnd"/>
+      <w:r>
+        <w:t>-select --install</w:t>
       </w:r>
     </w:p>
     <w:p>
       <w:pPr>
-        <w:pStyle w:val="ListBullet"/>
+        <w:tabs>
+          <w:tab w:val="left" w:pos="560"/>
+          <w:tab w:val="left" w:pos="1120"/>
+          <w:tab w:val="left" w:pos="1680"/>
+          <w:tab w:val="left" w:pos="2240"/>
+          <w:tab w:val="left" w:pos="2800"/>
+          <w:tab w:val="left" w:pos="3360"/>
+          <w:tab w:val="left" w:pos="3920"/>
+          <w:tab w:val="left" w:pos="4480"/>
+          <w:tab w:val="left" w:pos="5040"/>
+          <w:tab w:val="left" w:pos="5600"/>
+          <w:tab w:val="left" w:pos="6160"/>
+          <w:tab w:val="left" w:pos="6720"/>
+        </w:tabs>
+        <w:autoSpaceDE w:val="0"/>
+        <w:autoSpaceDN w:val="0"/>
+        <w:adjustRightInd w:val="0"/>
+        <w:spacing w:after="0" w:line="240" w:lineRule="auto"/>
       </w:pPr>
       <w:r>
-        <w:rPr>
-          <w:rFonts w:ascii="Consolas" w:hAnsi="Consolas"/>
-          <w:sz w:val="20"/>
-        </w:rPr>
-        <w:t>_thermode_&lt;timestamp&gt;.json</w:t>
+        <w:t xml:space="preserve">  - </w:t>
       </w:r>
+      <w:proofErr w:type="spellStart"/>
       <w:r>
-        <w:t xml:space="preserve"> — Column definitions and full experiment config</w:t>
+        <w:t>GStreamer</w:t>
+      </w:r>
+      <w:proofErr w:type="spellEnd"/>
+      <w:r>
+        <w:t xml:space="preserve"> (for audio/video): download from https://gstreamer.freedesktop.org/download/   </w:t>
       </w:r>
     </w:p>
-    <w:p>
-      <w:pPr>
-        <w:pStyle w:val="ListBullet"/>
-      </w:pPr>
-      <w:r>
-        <w:rPr>
-          <w:rFonts w:ascii="Consolas" w:hAnsi="Consolas"/>
-          <w:sz w:val="20"/>
-        </w:rPr>
-        <w:t>_qc_&lt;timestamp&gt;.tsv</w:t>
-      </w:r>
-      <w:r>
-        <w:t xml:space="preserve"> — Per-cycle QC metrics</w:t>
-      </w:r>
-    </w:p>
-    <w:p>
-      <w:pPr>
-        <w:pStyle w:val="Heading1"/>
-      </w:pPr>
-      <w:r>
-        <w:lastRenderedPageBreak/>
-        <w:t>5. Common problems</w:t>
-      </w:r>
-    </w:p>
-    <w:p>
-      <w:r>
-        <w:rPr>
-          <w:b/>
-        </w:rPr>
-        <w:t>"python3" is not recognised / command not found</w:t>
-      </w:r>
-    </w:p>
-    <w:p>
-      <w:r>
-        <w:t>Try python, py, or py -3 instead (see Section 1.1). On Windows, if you installed Python from the Microsoft Store, the command is python. If nothing works, reinstall Python and tick "Add Python to PATH" during installation.</w:t>
-      </w:r>
-    </w:p>
-    <w:p>
-      <w:r>
-        <w:rPr>
-          <w:b/>
-        </w:rPr>
-        <w:t>ModuleNotFoundError: No module named 'psychopy'</w:t>
-      </w:r>
-    </w:p>
-    <w:p>
-      <w:r>
-        <w:t>PsychoPy is not installed in the Python environment you are using. Run:</w:t>
-      </w:r>
-      <w:r>
-        <w:br/>
-        <w:t>pip3 install psychopy</w:t>
-      </w:r>
-      <w:r>
-        <w:br/>
-        <w:t>If pip3 is not found, try: python3 -m pip install psychopy</w:t>
-      </w:r>
-    </w:p>
-    <w:p>
-      <w:r>
-        <w:rPr>
-          <w:b/>
-        </w:rPr>
-        <w:t>ModuleNotFoundError: No module named 'numpy' (or scipy, matplotlib)</w:t>
-      </w:r>
-    </w:p>
-    <w:p>
-      <w:r>
-        <w:t>Install the missing package:</w:t>
-      </w:r>
-      <w:r>
-        <w:br/>
-        <w:t>pip3 install numpy scipy matplotlib</w:t>
-      </w:r>
-    </w:p>
-    <w:p>
-      <w:r>
-        <w:rPr>
-          <w:b/>
-        </w:rPr>
-        <w:t>PsychoPy window does not appear / crashes</w:t>
-      </w:r>
-    </w:p>
-    <w:p>
-      <w:r>
-        <w:t>Make sure fullscreen is set to False and screen_index is set to 0 in config_v3.py. If using a remote/virtual desktop, PsychoPy may have trouble creating an OpenGL window.</w:t>
-      </w:r>
-    </w:p>
-    <w:p>
-      <w:r>
-        <w:rPr>
-          <w:b/>
-        </w:rPr>
-        <w:t>GUI dialog does not appear</w:t>
-      </w:r>
-    </w:p>
-    <w:p>
-      <w:r>
-        <w:t>PsychoPy GUI dialogs require a display. This will not work over a headless SSH session. Use a desktop environment or VNC/X11 forwarding.</w:t>
-      </w:r>
-    </w:p>
-    <w:p>
-      <w:r>
-        <w:rPr>
-          <w:b/>
-        </w:rPr>
-        <w:t>"Permission denied" when running the script</w:t>
-      </w:r>
-    </w:p>
-    <w:p>
-      <w:r>
-        <w:t>Try: python3 run_experiment.py (not ./run_experiment.py). If the issue is writing output files, check you have write permission to the thermal/data/ folder.</w:t>
-      </w:r>
-    </w:p>
-    <w:p>
-      <w:r>
-        <w:rPr>
-          <w:b/>
-        </w:rPr>
-        <w:t>Block appears as already completed when it has not been run</w:t>
-      </w:r>
-    </w:p>
-    <w:p>
-      <w:r>
-        <w:t>The script detects completed blocks by scanning for existing output files. If there are leftover files from a previous test, delete or move them from thermal/data/sub-&lt;ID&gt;/ses-&lt;session&gt;/func/.</w:t>
-      </w:r>
-    </w:p>
-    <w:p>
-      <w:r>
-        <w:rPr>
-          <w:b/>
-        </w:rPr>
-        <w:t>Script tries to connect to the thermode despite simulation mode</w:t>
-      </w:r>
-    </w:p>
-    <w:p>
-      <w:r>
-        <w:t>Double-check that simulation is set to True (not the string "True") in config_v3.py. The value must be the Python boolean True, not a string.</w:t>
-      </w:r>
-    </w:p>
-    <w:p>
-      <w:r>
-        <w:rPr>
-          <w:b/>
-        </w:rPr>
-        <w:t>Permission denied on /dev/ttyACM0 (Linux)</w:t>
-      </w:r>
-    </w:p>
-    <w:p>
-      <w:r>
-        <w:t>Add your user to the dialout group (see Section 2) and re-login.</w:t>
-      </w:r>
-    </w:p>
-    <w:p>
-      <w:r>
-        <w:rPr>
-          <w:b/>
-        </w:rPr>
-        <w:lastRenderedPageBreak/>
-        <w:t>PsychoPy window fails over SSH (Linux)</w:t>
-      </w:r>
-    </w:p>
-    <w:p>
-      <w:r>
-        <w:t>PsychoPy needs a display. Use ssh -X or a VNC session.</w:t>
-      </w:r>
-    </w:p>
-    <w:p>
-      <w:pPr>
-        <w:pStyle w:val="Heading1"/>
-      </w:pPr>
-      <w:r>
-        <w:t>6. Quick reference</w:t>
-      </w:r>
-    </w:p>
-    <w:tbl>
-      <w:tblPr>
-        <w:tblStyle w:val="LightList-Accent1"/>
-        <w:tblW w:w="0" w:type="auto"/>
-        <w:tblLook w:val="04A0" w:firstRow="1" w:lastRow="0" w:firstColumn="1" w:lastColumn="0" w:noHBand="0" w:noVBand="1"/>
-      </w:tblPr>
-      <w:tblGrid>
-        <w:gridCol w:w="4320"/>
-        <w:gridCol w:w="4320"/>
-      </w:tblGrid>
-      <w:tr>
-        <w:trPr>
-          <w:cnfStyle w:val="100000000000" w:firstRow="1" w:lastRow="0" w:firstColumn="0" w:lastColumn="0" w:oddVBand="0" w:evenVBand="0" w:oddHBand="0" w:evenHBand="0" w:firstRowFirstColumn="0" w:firstRowLastColumn="0" w:lastRowFirstColumn="0" w:lastRowLastColumn="0"/>
-        </w:trPr>
-        <w:tc>
-          <w:tcPr>
-            <w:cnfStyle w:val="001000000000" w:firstRow="0" w:lastRow="0" w:firstColumn="1" w:lastColumn="0" w:oddVBand="0" w:evenVBand="0" w:oddHBand="0" w:evenHBand="0" w:firstRowFirstColumn="0" w:firstRowLastColumn="0" w:lastRowFirstColumn="0" w:lastRowLastColumn="0"/>
-            <w:tcW w:w="4320" w:type="dxa"/>
-          </w:tcPr>
-          <w:p>
-            <w:r>
-              <w:t>Action</w:t>
-            </w:r>
-          </w:p>
-        </w:tc>
-        <w:tc>
-          <w:tcPr>
-            <w:tcW w:w="4320" w:type="dxa"/>
-          </w:tcPr>
-          <w:p>
-            <w:pPr>
-              <w:cnfStyle w:val="100000000000" w:firstRow="1" w:lastRow="0" w:firstColumn="0" w:lastColumn="0" w:oddVBand="0" w:evenVBand="0" w:oddHBand="0" w:evenHBand="0" w:firstRowFirstColumn="0" w:firstRowLastColumn="0" w:lastRowFirstColumn="0" w:lastRowLastColumn="0"/>
-            </w:pPr>
-            <w:r>
-              <w:t>Command</w:t>
-            </w:r>
-          </w:p>
-        </w:tc>
-      </w:tr>
-      <w:tr>
-        <w:trPr>
-          <w:cnfStyle w:val="000000100000" w:firstRow="0" w:lastRow="0" w:firstColumn="0" w:lastColumn="0" w:oddVBand="0" w:evenVBand="0" w:oddHBand="1" w:evenHBand="0" w:firstRowFirstColumn="0" w:firstRowLastColumn="0" w:lastRowFirstColumn="0" w:lastRowLastColumn="0"/>
-        </w:trPr>
-        <w:tc>
-          <w:tcPr>
-            <w:cnfStyle w:val="001000000000" w:firstRow="0" w:lastRow="0" w:firstColumn="1" w:lastColumn="0" w:oddVBand="0" w:evenVBand="0" w:oddHBand="0" w:evenHBand="0" w:firstRowFirstColumn="0" w:firstRowLastColumn="0" w:lastRowFirstColumn="0" w:lastRowLastColumn="0"/>
-            <w:tcW w:w="4320" w:type="dxa"/>
-          </w:tcPr>
-          <w:p>
-            <w:r>
-              <w:t>Check Python version</w:t>
-            </w:r>
-          </w:p>
-        </w:tc>
-        <w:tc>
-          <w:tcPr>
-            <w:tcW w:w="4320" w:type="dxa"/>
-          </w:tcPr>
-          <w:p>
-            <w:pPr>
-              <w:cnfStyle w:val="000000100000" w:firstRow="0" w:lastRow="0" w:firstColumn="0" w:lastColumn="0" w:oddVBand="0" w:evenVBand="0" w:oddHBand="1" w:evenHBand="0" w:firstRowFirstColumn="0" w:firstRowLastColumn="0" w:lastRowFirstColumn="0" w:lastRowLastColumn="0"/>
-            </w:pPr>
-            <w:r>
-              <w:rPr>
-                <w:rFonts w:ascii="Consolas" w:hAnsi="Consolas"/>
-                <w:sz w:val="20"/>
-              </w:rPr>
-              <w:t>python3 --version</w:t>
-            </w:r>
-          </w:p>
-        </w:tc>
-      </w:tr>
-      <w:tr>
-        <w:tc>
-          <w:tcPr>
-            <w:cnfStyle w:val="001000000000" w:firstRow="0" w:lastRow="0" w:firstColumn="1" w:lastColumn="0" w:oddVBand="0" w:evenVBand="0" w:oddHBand="0" w:evenHBand="0" w:firstRowFirstColumn="0" w:firstRowLastColumn="0" w:lastRowFirstColumn="0" w:lastRowLastColumn="0"/>
-            <w:tcW w:w="4320" w:type="dxa"/>
-          </w:tcPr>
-          <w:p>
-            <w:r>
-              <w:t>Check PsychoPy</w:t>
-            </w:r>
-          </w:p>
-        </w:tc>
-        <w:tc>
-          <w:tcPr>
-            <w:tcW w:w="4320" w:type="dxa"/>
-          </w:tcPr>
-          <w:p>
-            <w:pPr>
-              <w:cnfStyle w:val="000000000000" w:firstRow="0" w:lastRow="0" w:firstColumn="0" w:lastColumn="0" w:oddVBand="0" w:evenVBand="0" w:oddHBand="0" w:evenHBand="0" w:firstRowFirstColumn="0" w:firstRowLastColumn="0" w:lastRowFirstColumn="0" w:lastRowLastColumn="0"/>
-            </w:pPr>
-            <w:r>
-              <w:rPr>
-                <w:rFonts w:ascii="Consolas" w:hAnsi="Consolas"/>
-                <w:sz w:val="20"/>
-              </w:rPr>
-              <w:t>python3 -c "import psychopy; print(psychopy.__version__)"</w:t>
-            </w:r>
-          </w:p>
-        </w:tc>
-      </w:tr>
-      <w:tr>
-        <w:trPr>
-          <w:cnfStyle w:val="000000100000" w:firstRow="0" w:lastRow="0" w:firstColumn="0" w:lastColumn="0" w:oddVBand="0" w:evenVBand="0" w:oddHBand="1" w:evenHBand="0" w:firstRowFirstColumn="0" w:firstRowLastColumn="0" w:lastRowFirstColumn="0" w:lastRowLastColumn="0"/>
-        </w:trPr>
-        <w:tc>
-          <w:tcPr>
-            <w:cnfStyle w:val="001000000000" w:firstRow="0" w:lastRow="0" w:firstColumn="1" w:lastColumn="0" w:oddVBand="0" w:evenVBand="0" w:oddHBand="0" w:evenHBand="0" w:firstRowFirstColumn="0" w:firstRowLastColumn="0" w:lastRowFirstColumn="0" w:lastRowLastColumn="0"/>
-            <w:tcW w:w="4320" w:type="dxa"/>
-          </w:tcPr>
-          <w:p>
-            <w:r>
-              <w:t>Pre-check (simulation)</w:t>
-            </w:r>
-          </w:p>
-        </w:tc>
-        <w:tc>
-          <w:tcPr>
-            <w:tcW w:w="4320" w:type="dxa"/>
-          </w:tcPr>
-          <w:p>
-            <w:pPr>
-              <w:cnfStyle w:val="000000100000" w:firstRow="0" w:lastRow="0" w:firstColumn="0" w:lastColumn="0" w:oddVBand="0" w:evenVBand="0" w:oddHBand="1" w:evenHBand="0" w:firstRowFirstColumn="0" w:firstRowLastColumn="0" w:lastRowFirstColumn="0" w:lastRowLastColumn="0"/>
-            </w:pPr>
-            <w:r>
-              <w:rPr>
-                <w:rFonts w:ascii="Consolas" w:hAnsi="Consolas"/>
-                <w:sz w:val="20"/>
-              </w:rPr>
-              <w:t>python3 thermode_precheck.py</w:t>
-            </w:r>
-          </w:p>
-        </w:tc>
-      </w:tr>
-      <w:tr>
-        <w:tc>
-          <w:tcPr>
-            <w:cnfStyle w:val="001000000000" w:firstRow="0" w:lastRow="0" w:firstColumn="1" w:lastColumn="0" w:oddVBand="0" w:evenVBand="0" w:oddHBand="0" w:evenHBand="0" w:firstRowFirstColumn="0" w:firstRowLastColumn="0" w:lastRowFirstColumn="0" w:lastRowLastColumn="0"/>
-            <w:tcW w:w="4320" w:type="dxa"/>
-          </w:tcPr>
-          <w:p>
-            <w:r>
-              <w:t>Run one block</w:t>
-            </w:r>
-          </w:p>
-        </w:tc>
-        <w:tc>
-          <w:tcPr>
-            <w:tcW w:w="4320" w:type="dxa"/>
-          </w:tcPr>
-          <w:p>
-            <w:pPr>
-              <w:cnfStyle w:val="000000000000" w:firstRow="0" w:lastRow="0" w:firstColumn="0" w:lastColumn="0" w:oddVBand="0" w:evenVBand="0" w:oddHBand="0" w:evenHBand="0" w:firstRowFirstColumn="0" w:firstRowLastColumn="0" w:lastRowFirstColumn="0" w:lastRowLastColumn="0"/>
-            </w:pPr>
-            <w:r>
-              <w:rPr>
-                <w:rFonts w:ascii="Consolas" w:hAnsi="Consolas"/>
-                <w:sz w:val="20"/>
-              </w:rPr>
-              <w:t>python3 run_experiment.py</w:t>
-            </w:r>
-          </w:p>
-        </w:tc>
-      </w:tr>
-      <w:tr>
-        <w:trPr>
-          <w:cnfStyle w:val="000000100000" w:firstRow="0" w:lastRow="0" w:firstColumn="0" w:lastColumn="0" w:oddVBand="0" w:evenVBand="0" w:oddHBand="1" w:evenHBand="0" w:firstRowFirstColumn="0" w:firstRowLastColumn="0" w:lastRowFirstColumn="0" w:lastRowLastColumn="0"/>
-        </w:trPr>
-        <w:tc>
-          <w:tcPr>
-            <w:cnfStyle w:val="001000000000" w:firstRow="0" w:lastRow="0" w:firstColumn="1" w:lastColumn="0" w:oddVBand="0" w:evenVBand="0" w:oddHBand="0" w:evenHBand="0" w:firstRowFirstColumn="0" w:firstRowLastColumn="0" w:lastRowFirstColumn="0" w:lastRowLastColumn="0"/>
-            <w:tcW w:w="4320" w:type="dxa"/>
-          </w:tcPr>
-          <w:p>
-            <w:r>
-              <w:t>Live QC dashboard</w:t>
-            </w:r>
-          </w:p>
-        </w:tc>
-        <w:tc>
-          <w:tcPr>
-            <w:tcW w:w="4320" w:type="dxa"/>
-          </w:tcPr>
-          <w:p>
-            <w:pPr>
-              <w:cnfStyle w:val="000000100000" w:firstRow="0" w:lastRow="0" w:firstColumn="0" w:lastColumn="0" w:oddVBand="0" w:evenVBand="0" w:oddHBand="1" w:evenHBand="0" w:firstRowFirstColumn="0" w:firstRowLastColumn="0" w:lastRowFirstColumn="0" w:lastRowLastColumn="0"/>
-            </w:pPr>
-            <w:r>
-              <w:rPr>
-                <w:rFonts w:ascii="Consolas" w:hAnsi="Consolas"/>
-                <w:sz w:val="20"/>
-              </w:rPr>
-              <w:t>python3 qc_monitor.py</w:t>
-            </w:r>
-          </w:p>
-        </w:tc>
-      </w:tr>
-      <w:tr>
-        <w:tc>
-          <w:tcPr>
-            <w:cnfStyle w:val="001000000000" w:firstRow="0" w:lastRow="0" w:firstColumn="1" w:lastColumn="0" w:oddVBand="0" w:evenVBand="0" w:oddHBand="0" w:evenHBand="0" w:firstRowFirstColumn="0" w:firstRowLastColumn="0" w:lastRowFirstColumn="0" w:lastRowLastColumn="0"/>
-            <w:tcW w:w="4320" w:type="dxa"/>
-          </w:tcPr>
-          <w:p>
-            <w:r>
-              <w:t>Find serial port (Linux)</w:t>
-            </w:r>
-          </w:p>
-        </w:tc>
-        <w:tc>
-          <w:tcPr>
-            <w:tcW w:w="4320" w:type="dxa"/>
-          </w:tcPr>
-          <w:p>
-            <w:pPr>
-              <w:cnfStyle w:val="000000000000" w:firstRow="0" w:lastRow="0" w:firstColumn="0" w:lastColumn="0" w:oddVBand="0" w:evenVBand="0" w:oddHBand="0" w:evenHBand="0" w:firstRowFirstColumn="0" w:firstRowLastColumn="0" w:lastRowFirstColumn="0" w:lastRowLastColumn="0"/>
-            </w:pPr>
-            <w:r>
-              <w:rPr>
-                <w:rFonts w:ascii="Consolas" w:hAnsi="Consolas"/>
-                <w:sz w:val="20"/>
-              </w:rPr>
-              <w:t>ls /dev/ttyACM*</w:t>
-            </w:r>
-          </w:p>
-        </w:tc>
-      </w:tr>
-      <w:tr>
-        <w:trPr>
-          <w:cnfStyle w:val="000000100000" w:firstRow="0" w:lastRow="0" w:firstColumn="0" w:lastColumn="0" w:oddVBand="0" w:evenVBand="0" w:oddHBand="1" w:evenHBand="0" w:firstRowFirstColumn="0" w:firstRowLastColumn="0" w:lastRowFirstColumn="0" w:lastRowLastColumn="0"/>
-        </w:trPr>
-        <w:tc>
-          <w:tcPr>
-            <w:cnfStyle w:val="001000000000" w:firstRow="0" w:lastRow="0" w:firstColumn="1" w:lastColumn="0" w:oddVBand="0" w:evenVBand="0" w:oddHBand="0" w:evenHBand="0" w:firstRowFirstColumn="0" w:firstRowLastColumn="0" w:lastRowFirstColumn="0" w:lastRowLastColumn="0"/>
-            <w:tcW w:w="4320" w:type="dxa"/>
-          </w:tcPr>
-          <w:p>
-            <w:r>
-              <w:t>Fix serial permissions (Linux)</w:t>
-            </w:r>
-          </w:p>
-        </w:tc>
-        <w:tc>
-          <w:tcPr>
-            <w:tcW w:w="4320" w:type="dxa"/>
-          </w:tcPr>
-          <w:p>
-            <w:pPr>
-              <w:cnfStyle w:val="000000100000" w:firstRow="0" w:lastRow="0" w:firstColumn="0" w:lastColumn="0" w:oddVBand="0" w:evenVBand="0" w:oddHBand="1" w:evenHBand="0" w:firstRowFirstColumn="0" w:firstRowLastColumn="0" w:lastRowFirstColumn="0" w:lastRowLastColumn="0"/>
-            </w:pPr>
-            <w:r>
-              <w:rPr>
-                <w:rFonts w:ascii="Consolas" w:hAnsi="Consolas"/>
-                <w:sz w:val="20"/>
-              </w:rPr>
-              <w:t>sudo usermod -aG dialout $USER</w:t>
-            </w:r>
-          </w:p>
-        </w:tc>
-      </w:tr>
-      <w:tr>
-        <w:tc>
-          <w:tcPr>
-            <w:cnfStyle w:val="001000000000" w:firstRow="0" w:lastRow="0" w:firstColumn="1" w:lastColumn="0" w:oddVBand="0" w:evenVBand="0" w:oddHBand="0" w:evenHBand="0" w:firstRowFirstColumn="0" w:firstRowLastColumn="0" w:lastRowFirstColumn="0" w:lastRowLastColumn="0"/>
-            <w:tcW w:w="4320" w:type="dxa"/>
-          </w:tcPr>
-          <w:p>
-            <w:r>
-              <w:t>Check setup</w:t>
-            </w:r>
-          </w:p>
-        </w:tc>
-        <w:tc>
-          <w:tcPr>
-            <w:tcW w:w="4320" w:type="dxa"/>
-          </w:tcPr>
-          <w:p>
-            <w:pPr>
-              <w:cnfStyle w:val="000000000000" w:firstRow="0" w:lastRow="0" w:firstColumn="0" w:lastColumn="0" w:oddVBand="0" w:evenVBand="0" w:oddHBand="0" w:evenHBand="0" w:firstRowFirstColumn="0" w:firstRowLastColumn="0" w:lastRowFirstColumn="0" w:lastRowLastColumn="0"/>
-            </w:pPr>
-            <w:r>
-              <w:rPr>
-                <w:rFonts w:ascii="Consolas" w:hAnsi="Consolas"/>
-                <w:sz w:val="20"/>
-              </w:rPr>
-              <w:t>bash check_setup.sh</w:t>
-            </w:r>
-          </w:p>
-        </w:tc>
-      </w:tr>
-    </w:tbl>
-    <w:p/>
     <w:sectPr>
       <w:pgSz w:w="12240" w:h="15840"/>
       <w:pgMar w:top="1440" w:right="1800" w:bottom="1440" w:left="1800" w:header="720" w:footer="720" w:gutter="0"/>
@@ -1651,6 +1594,119 @@
       </w:rPr>
     </w:lvl>
   </w:abstractNum>
+  <w:abstractNum w:abstractNumId="9" w15:restartNumberingAfterBreak="0">
+    <w:nsid w:val="33131914"/>
+    <w:multiLevelType w:val="hybridMultilevel"/>
+    <w:tmpl w:val="5F28F1FE"/>
+    <w:lvl w:ilvl="0" w:tplc="0E40E7DC">
+      <w:start w:val="4"/>
+      <w:numFmt w:val="bullet"/>
+      <w:lvlText w:val=""/>
+      <w:lvlJc w:val="left"/>
+      <w:pPr>
+        <w:ind w:left="720" w:hanging="360"/>
+      </w:pPr>
+      <w:rPr>
+        <w:rFonts w:ascii="Wingdings" w:eastAsiaTheme="minorEastAsia" w:hAnsi="Wingdings" w:cstheme="minorBidi" w:hint="default"/>
+      </w:rPr>
+    </w:lvl>
+    <w:lvl w:ilvl="1" w:tplc="08090003" w:tentative="1">
+      <w:start w:val="1"/>
+      <w:numFmt w:val="bullet"/>
+      <w:lvlText w:val="o"/>
+      <w:lvlJc w:val="left"/>
+      <w:pPr>
+        <w:ind w:left="1440" w:hanging="360"/>
+      </w:pPr>
+      <w:rPr>
+        <w:rFonts w:ascii="Courier New" w:hAnsi="Courier New" w:cs="Courier New" w:hint="default"/>
+      </w:rPr>
+    </w:lvl>
+    <w:lvl w:ilvl="2" w:tplc="08090005" w:tentative="1">
+      <w:start w:val="1"/>
+      <w:numFmt w:val="bullet"/>
+      <w:lvlText w:val=""/>
+      <w:lvlJc w:val="left"/>
+      <w:pPr>
+        <w:ind w:left="2160" w:hanging="360"/>
+      </w:pPr>
+      <w:rPr>
+        <w:rFonts w:ascii="Wingdings" w:hAnsi="Wingdings" w:hint="default"/>
+      </w:rPr>
+    </w:lvl>
+    <w:lvl w:ilvl="3" w:tplc="08090001" w:tentative="1">
+      <w:start w:val="1"/>
+      <w:numFmt w:val="bullet"/>
+      <w:lvlText w:val=""/>
+      <w:lvlJc w:val="left"/>
+      <w:pPr>
+        <w:ind w:left="2880" w:hanging="360"/>
+      </w:pPr>
+      <w:rPr>
+        <w:rFonts w:ascii="Symbol" w:hAnsi="Symbol" w:hint="default"/>
+      </w:rPr>
+    </w:lvl>
+    <w:lvl w:ilvl="4" w:tplc="08090003" w:tentative="1">
+      <w:start w:val="1"/>
+      <w:numFmt w:val="bullet"/>
+      <w:lvlText w:val="o"/>
+      <w:lvlJc w:val="left"/>
+      <w:pPr>
+        <w:ind w:left="3600" w:hanging="360"/>
+      </w:pPr>
+      <w:rPr>
+        <w:rFonts w:ascii="Courier New" w:hAnsi="Courier New" w:cs="Courier New" w:hint="default"/>
+      </w:rPr>
+    </w:lvl>
+    <w:lvl w:ilvl="5" w:tplc="08090005" w:tentative="1">
+      <w:start w:val="1"/>
+      <w:numFmt w:val="bullet"/>
+      <w:lvlText w:val=""/>
+      <w:lvlJc w:val="left"/>
+      <w:pPr>
+        <w:ind w:left="4320" w:hanging="360"/>
+      </w:pPr>
+      <w:rPr>
+        <w:rFonts w:ascii="Wingdings" w:hAnsi="Wingdings" w:hint="default"/>
+      </w:rPr>
+    </w:lvl>
+    <w:lvl w:ilvl="6" w:tplc="08090001" w:tentative="1">
+      <w:start w:val="1"/>
+      <w:numFmt w:val="bullet"/>
+      <w:lvlText w:val=""/>
+      <w:lvlJc w:val="left"/>
+      <w:pPr>
+        <w:ind w:left="5040" w:hanging="360"/>
+      </w:pPr>
+      <w:rPr>
+        <w:rFonts w:ascii="Symbol" w:hAnsi="Symbol" w:hint="default"/>
+      </w:rPr>
+    </w:lvl>
+    <w:lvl w:ilvl="7" w:tplc="08090003" w:tentative="1">
+      <w:start w:val="1"/>
+      <w:numFmt w:val="bullet"/>
+      <w:lvlText w:val="o"/>
+      <w:lvlJc w:val="left"/>
+      <w:pPr>
+        <w:ind w:left="5760" w:hanging="360"/>
+      </w:pPr>
+      <w:rPr>
+        <w:rFonts w:ascii="Courier New" w:hAnsi="Courier New" w:cs="Courier New" w:hint="default"/>
+      </w:rPr>
+    </w:lvl>
+    <w:lvl w:ilvl="8" w:tplc="08090005" w:tentative="1">
+      <w:start w:val="1"/>
+      <w:numFmt w:val="bullet"/>
+      <w:lvlText w:val=""/>
+      <w:lvlJc w:val="left"/>
+      <w:pPr>
+        <w:ind w:left="6480" w:hanging="360"/>
+      </w:pPr>
+      <w:rPr>
+        <w:rFonts w:ascii="Wingdings" w:hAnsi="Wingdings" w:hint="default"/>
+      </w:rPr>
+    </w:lvl>
+  </w:abstractNum>
   <w:num w:numId="1" w16cid:durableId="618953343">
     <w:abstractNumId w:val="8"/>
   </w:num>
@@ -1677,6 +1733,9 @@
   </w:num>
   <w:num w:numId="9" w16cid:durableId="782458044">
     <w:abstractNumId w:val="0"/>
+  </w:num>
+  <w:num w:numId="10" w16cid:durableId="2047950938">
+    <w:abstractNumId w:val="9"/>
   </w:num>
 </w:numbering>
 </file>

</xml_diff>

<commit_message>
Clean up repo: remove pilot directory, archive old configs, update test data
- Remove pilot_leipzig_june2026/ (merged into fMRI_triangular_wave/)
- Remove old test data (sub-1111, sub-1112, sub-1122, sub-1133)
- Add sub-1113 test data
- Rename ds5.py -> ds5_test.py (read-only pilot reference)
- Remove ds5_triangle.py, run_single_half.py, test_single_pulse.py
- Archive config_v2.py, config_v3.py into thermal/pilots/
- Remove TCS manual PDF, check_setup.sh
- Add waveform_full_run.png (electrical waveform reference plot)
</commit_message>
<xml_diff>
--- a/fMRI_triangular_wave/thermal/docs/thermal_simulation_guide.docx
+++ b/fMRI_triangular_wave/thermal/docs/thermal_simulation_guide.docx
@@ -44,10 +44,10 @@
       <w:pPr>
         <w:pStyle w:val="Heading1"/>
         <w:spacing w:before="0"/>
+        <w:rPr>
+          <w:color w:val="A6A6A6" w:themeColor="background1" w:themeShade="A6"/>
+        </w:rPr>
       </w:pPr>
-      <w:r>
-        <w:t>Open your terminal</w:t>
-      </w:r>
     </w:p>
     <w:tbl>
       <w:tblPr>
@@ -69,86 +69,7 @@
               <w:rPr>
                 <w:b/>
                 <w:bCs/>
-                <w:highlight w:val="green"/>
-              </w:rPr>
-            </w:pPr>
-            <w:proofErr w:type="spellStart"/>
-            <w:r>
-              <w:rPr>
-                <w:b/>
-                <w:bCs/>
-                <w:highlight w:val="green"/>
-              </w:rPr>
-              <w:t>conda</w:t>
-            </w:r>
-            <w:proofErr w:type="spellEnd"/>
-            <w:r>
-              <w:rPr>
-                <w:b/>
-                <w:bCs/>
-                <w:highlight w:val="green"/>
-              </w:rPr>
-              <w:t xml:space="preserve"> activate </w:t>
-            </w:r>
-            <w:proofErr w:type="spellStart"/>
-            <w:r>
-              <w:rPr>
-                <w:b/>
-                <w:bCs/>
-                <w:highlight w:val="green"/>
-              </w:rPr>
-              <w:t>psychopy</w:t>
-            </w:r>
-            <w:proofErr w:type="spellEnd"/>
-          </w:p>
-        </w:tc>
-        <w:tc>
-          <w:tcPr>
-            <w:tcW w:w="5062" w:type="dxa"/>
-          </w:tcPr>
-          <w:p>
-            <w:r>
-              <w:t>Depending on your local setup</w:t>
-            </w:r>
-          </w:p>
-        </w:tc>
-      </w:tr>
-    </w:tbl>
-    <w:p>
-      <w:pPr>
-        <w:pStyle w:val="Heading1"/>
-        <w:spacing w:before="0"/>
-      </w:pPr>
-    </w:p>
-    <w:p>
-      <w:pPr>
-        <w:pStyle w:val="Heading1"/>
-        <w:spacing w:before="0"/>
-      </w:pPr>
-      <w:r>
-        <w:t>Initial checks via scripts</w:t>
-      </w:r>
-    </w:p>
-    <w:tbl>
-      <w:tblPr>
-        <w:tblStyle w:val="TableGrid"/>
-        <w:tblW w:w="0" w:type="auto"/>
-        <w:tblLook w:val="04A0" w:firstRow="1" w:lastRow="0" w:firstColumn="1" w:lastColumn="0" w:noHBand="0" w:noVBand="1"/>
-      </w:tblPr>
-      <w:tblGrid>
-        <w:gridCol w:w="3794"/>
-        <w:gridCol w:w="5062"/>
-      </w:tblGrid>
-      <w:tr>
-        <w:tc>
-          <w:tcPr>
-            <w:tcW w:w="3794" w:type="dxa"/>
-          </w:tcPr>
-          <w:p>
-            <w:pPr>
-              <w:rPr>
-                <w:b/>
-                <w:bCs/>
+                <w:color w:val="A6A6A6" w:themeColor="background1" w:themeShade="A6"/>
               </w:rPr>
             </w:pPr>
             <w:r>
@@ -156,9 +77,10 @@
                 <w:rFonts w:ascii="Consolas" w:hAnsi="Consolas"/>
                 <w:b/>
                 <w:bCs/>
+                <w:color w:val="A6A6A6" w:themeColor="background1" w:themeShade="A6"/>
                 <w:sz w:val="20"/>
               </w:rPr>
-              <w:t>bash check_setup.sh</w:t>
+              <w:t>Requirements</w:t>
             </w:r>
           </w:p>
           <w:p>
@@ -166,6 +88,7 @@
               <w:rPr>
                 <w:b/>
                 <w:bCs/>
+                <w:color w:val="A6A6A6" w:themeColor="background1" w:themeShade="A6"/>
               </w:rPr>
             </w:pPr>
           </w:p>
@@ -175,300 +98,104 @@
             <w:tcW w:w="5062" w:type="dxa"/>
           </w:tcPr>
           <w:p>
+            <w:pPr>
+              <w:rPr>
+                <w:color w:val="A6A6A6" w:themeColor="background1" w:themeShade="A6"/>
+              </w:rPr>
+            </w:pPr>
             <w:r>
-              <w:t xml:space="preserve">This checks Python, </w:t>
+              <w:rPr>
+                <w:color w:val="A6A6A6" w:themeColor="background1" w:themeShade="A6"/>
+              </w:rPr>
+              <w:t>C</w:t>
+            </w:r>
+            <w:r>
+              <w:rPr>
+                <w:color w:val="A6A6A6" w:themeColor="background1" w:themeShade="A6"/>
+              </w:rPr>
+              <w:t>heck</w:t>
+            </w:r>
+            <w:r>
+              <w:rPr>
+                <w:color w:val="A6A6A6" w:themeColor="background1" w:themeShade="A6"/>
+              </w:rPr>
+              <w:t xml:space="preserve"> that</w:t>
+            </w:r>
+            <w:r>
+              <w:rPr>
+                <w:color w:val="A6A6A6" w:themeColor="background1" w:themeShade="A6"/>
+              </w:rPr>
+              <w:t xml:space="preserve"> Python, </w:t>
             </w:r>
             <w:proofErr w:type="spellStart"/>
             <w:r>
+              <w:rPr>
+                <w:color w:val="A6A6A6" w:themeColor="background1" w:themeShade="A6"/>
+              </w:rPr>
               <w:t>PsychoPy</w:t>
             </w:r>
             <w:proofErr w:type="spellEnd"/>
             <w:r>
+              <w:rPr>
+                <w:color w:val="A6A6A6" w:themeColor="background1" w:themeShade="A6"/>
+              </w:rPr>
               <w:t xml:space="preserve">, </w:t>
             </w:r>
             <w:proofErr w:type="spellStart"/>
             <w:r>
-              <w:t>numpy</w:t>
-            </w:r>
-            <w:proofErr w:type="spellEnd"/>
-            <w:r>
-              <w:t xml:space="preserve">, </w:t>
-            </w:r>
-            <w:proofErr w:type="spellStart"/>
-            <w:r>
-              <w:t>scipy</w:t>
-            </w:r>
-            <w:proofErr w:type="spellEnd"/>
-            <w:r>
-              <w:t xml:space="preserve">, matplotlib, and that the experiment scripts are present. </w:t>
-            </w:r>
-          </w:p>
-          <w:p/>
-        </w:tc>
-      </w:tr>
-      <w:tr>
-        <w:tc>
-          <w:tcPr>
-            <w:tcW w:w="3794" w:type="dxa"/>
-          </w:tcPr>
-          <w:p>
-            <w:pPr>
               <w:rPr>
-                <w:b/>
-                <w:bCs/>
-              </w:rPr>
-            </w:pPr>
-            <w:r>
-              <w:rPr>
-                <w:rFonts w:ascii="Consolas" w:hAnsi="Consolas"/>
-                <w:b/>
-                <w:bCs/>
-                <w:sz w:val="20"/>
-              </w:rPr>
-              <w:t>bash check_setup.sh --thermode</w:t>
-            </w:r>
-          </w:p>
-          <w:p>
-            <w:pPr>
-              <w:rPr>
-                <w:b/>
-                <w:bCs/>
-              </w:rPr>
-            </w:pPr>
-          </w:p>
-        </w:tc>
-        <w:tc>
-          <w:tcPr>
-            <w:tcW w:w="5062" w:type="dxa"/>
-          </w:tcPr>
-          <w:p>
-            <w:r>
-              <w:t>Check the thermode connection</w:t>
-            </w:r>
-          </w:p>
-        </w:tc>
-      </w:tr>
-    </w:tbl>
-    <w:p>
-      <w:pPr>
-        <w:pStyle w:val="Heading1"/>
-        <w:spacing w:before="0"/>
-      </w:pPr>
-    </w:p>
-    <w:p>
-      <w:pPr>
-        <w:pStyle w:val="Heading1"/>
-        <w:spacing w:before="0"/>
-      </w:pPr>
-      <w:r>
-        <w:t>Individual checks</w:t>
-      </w:r>
-    </w:p>
-    <w:tbl>
-      <w:tblPr>
-        <w:tblStyle w:val="TableGrid"/>
-        <w:tblW w:w="0" w:type="auto"/>
-        <w:tblLook w:val="04A0" w:firstRow="1" w:lastRow="0" w:firstColumn="1" w:lastColumn="0" w:noHBand="0" w:noVBand="1"/>
-      </w:tblPr>
-      <w:tblGrid>
-        <w:gridCol w:w="3794"/>
-        <w:gridCol w:w="5062"/>
-      </w:tblGrid>
-      <w:tr>
-        <w:tc>
-          <w:tcPr>
-            <w:tcW w:w="3794" w:type="dxa"/>
-          </w:tcPr>
-          <w:p>
-            <w:r>
-              <w:rPr>
-                <w:rFonts w:ascii="Consolas" w:hAnsi="Consolas"/>
-                <w:b/>
-                <w:sz w:val="20"/>
-              </w:rPr>
-              <w:t>python --version</w:t>
-            </w:r>
-            <w:r>
-              <w:t xml:space="preserve">    </w:t>
-            </w:r>
-          </w:p>
-        </w:tc>
-        <w:tc>
-          <w:tcPr>
-            <w:tcW w:w="5062" w:type="dxa"/>
-          </w:tcPr>
-          <w:p>
-            <w:r>
-              <w:t>Check that python is installed</w:t>
-            </w:r>
-          </w:p>
-        </w:tc>
-      </w:tr>
-      <w:tr>
-        <w:tc>
-          <w:tcPr>
-            <w:tcW w:w="3794" w:type="dxa"/>
-          </w:tcPr>
-          <w:p>
-            <w:pPr>
-              <w:rPr>
-                <w:b/>
-                <w:bCs/>
-              </w:rPr>
-            </w:pPr>
-            <w:r>
-              <w:rPr>
-                <w:rFonts w:ascii="Consolas" w:hAnsi="Consolas"/>
-                <w:b/>
-                <w:bCs/>
-                <w:sz w:val="20"/>
-              </w:rPr>
-              <w:t xml:space="preserve">python -c "import </w:t>
-            </w:r>
-            <w:proofErr w:type="spellStart"/>
-            <w:r>
-              <w:rPr>
-                <w:rFonts w:ascii="Consolas" w:hAnsi="Consolas"/>
-                <w:b/>
-                <w:bCs/>
-                <w:sz w:val="20"/>
-              </w:rPr>
-              <w:t>psychopy</w:t>
-            </w:r>
-            <w:proofErr w:type="spellEnd"/>
-            <w:r>
-              <w:rPr>
-                <w:rFonts w:ascii="Consolas" w:hAnsi="Consolas"/>
-                <w:b/>
-                <w:bCs/>
-                <w:sz w:val="20"/>
-              </w:rPr>
-              <w:t>; print(</w:t>
-            </w:r>
-            <w:proofErr w:type="spellStart"/>
-            <w:proofErr w:type="gramStart"/>
-            <w:r>
-              <w:rPr>
-                <w:rFonts w:ascii="Consolas" w:hAnsi="Consolas"/>
-                <w:b/>
-                <w:bCs/>
-                <w:sz w:val="20"/>
-              </w:rPr>
-              <w:t>psychopy</w:t>
-            </w:r>
-            <w:proofErr w:type="spellEnd"/>
-            <w:r>
-              <w:rPr>
-                <w:rFonts w:ascii="Consolas" w:hAnsi="Consolas"/>
-                <w:b/>
-                <w:bCs/>
-                <w:sz w:val="20"/>
-              </w:rPr>
-              <w:t>._</w:t>
-            </w:r>
-            <w:proofErr w:type="gramEnd"/>
-            <w:r>
-              <w:rPr>
-                <w:rFonts w:ascii="Consolas" w:hAnsi="Consolas"/>
-                <w:b/>
-                <w:bCs/>
-                <w:sz w:val="20"/>
-              </w:rPr>
-              <w:t>_version__)"</w:t>
-            </w:r>
-          </w:p>
-          <w:p/>
-        </w:tc>
-        <w:tc>
-          <w:tcPr>
-            <w:tcW w:w="5062" w:type="dxa"/>
-          </w:tcPr>
-          <w:p>
-            <w:r>
-              <w:t xml:space="preserve">Check that </w:t>
-            </w:r>
-            <w:proofErr w:type="spellStart"/>
-            <w:r>
-              <w:t>psychopy</w:t>
-            </w:r>
-            <w:proofErr w:type="spellEnd"/>
-            <w:r>
-              <w:t xml:space="preserve"> is installed</w:t>
-            </w:r>
-          </w:p>
-        </w:tc>
-      </w:tr>
-      <w:tr>
-        <w:tc>
-          <w:tcPr>
-            <w:tcW w:w="3794" w:type="dxa"/>
-          </w:tcPr>
-          <w:p>
-            <w:pPr>
-              <w:rPr>
-                <w:b/>
-                <w:bCs/>
-              </w:rPr>
-            </w:pPr>
-            <w:r>
-              <w:rPr>
-                <w:rFonts w:ascii="Consolas" w:hAnsi="Consolas"/>
-                <w:b/>
-                <w:bCs/>
-                <w:sz w:val="20"/>
-              </w:rPr>
-              <w:t xml:space="preserve">python -c "import </w:t>
-            </w:r>
-            <w:proofErr w:type="spellStart"/>
-            <w:r>
-              <w:rPr>
-                <w:rFonts w:ascii="Consolas" w:hAnsi="Consolas"/>
-                <w:b/>
-                <w:bCs/>
-                <w:sz w:val="20"/>
+                <w:color w:val="A6A6A6" w:themeColor="background1" w:themeShade="A6"/>
               </w:rPr>
               <w:t>numpy</w:t>
             </w:r>
             <w:proofErr w:type="spellEnd"/>
             <w:r>
               <w:rPr>
-                <w:rFonts w:ascii="Consolas" w:hAnsi="Consolas"/>
-                <w:b/>
-                <w:bCs/>
-                <w:sz w:val="20"/>
+                <w:color w:val="A6A6A6" w:themeColor="background1" w:themeShade="A6"/>
               </w:rPr>
               <w:t xml:space="preserve">, </w:t>
             </w:r>
             <w:proofErr w:type="spellStart"/>
             <w:r>
               <w:rPr>
-                <w:rFonts w:ascii="Consolas" w:hAnsi="Consolas"/>
-                <w:b/>
-                <w:bCs/>
-                <w:sz w:val="20"/>
+                <w:color w:val="A6A6A6" w:themeColor="background1" w:themeShade="A6"/>
               </w:rPr>
               <w:t>scipy</w:t>
             </w:r>
             <w:proofErr w:type="spellEnd"/>
             <w:r>
               <w:rPr>
-                <w:rFonts w:ascii="Consolas" w:hAnsi="Consolas"/>
-                <w:b/>
-                <w:bCs/>
-                <w:sz w:val="20"/>
+                <w:color w:val="A6A6A6" w:themeColor="background1" w:themeShade="A6"/>
               </w:rPr>
-              <w:t>, matplotlib; print('OK')"</w:t>
+              <w:t xml:space="preserve">, matplotlib, and that the experiment scripts are present. </w:t>
             </w:r>
           </w:p>
-        </w:tc>
-        <w:tc>
-          <w:tcPr>
-            <w:tcW w:w="5062" w:type="dxa"/>
-          </w:tcPr>
           <w:p>
+            <w:pPr>
+              <w:rPr>
+                <w:color w:val="A6A6A6" w:themeColor="background1" w:themeShade="A6"/>
+              </w:rPr>
+            </w:pPr>
+          </w:p>
+          <w:p>
+            <w:pPr>
+              <w:rPr>
+                <w:color w:val="A6A6A6" w:themeColor="background1" w:themeShade="A6"/>
+              </w:rPr>
+            </w:pPr>
             <w:r>
-              <w:t>Check other dependencies.</w:t>
+              <w:rPr>
+                <w:color w:val="A6A6A6" w:themeColor="background1" w:themeShade="A6"/>
+              </w:rPr>
+              <w:t>TcsControl_python3</w:t>
             </w:r>
+          </w:p>
+          <w:p>
+            <w:pPr>
+              <w:rPr>
+                <w:color w:val="A6A6A6" w:themeColor="background1" w:themeShade="A6"/>
+              </w:rPr>
+            </w:pPr>
           </w:p>
         </w:tc>
       </w:tr>
@@ -563,10 +290,7 @@
           </w:tcPr>
           <w:p>
             <w:r>
-              <w:t>Live QC dashboard</w:t>
-            </w:r>
-            <w:r>
-              <w:t xml:space="preserve"> to run in a different terminal from the experiment</w:t>
+              <w:t>Live QC dashboard to run in a different terminal from the experiment</w:t>
             </w:r>
           </w:p>
         </w:tc>
@@ -602,46 +326,6 @@
           <w:p>
             <w:r>
               <w:t>Check that the thermode is responsive (e.g., after overheating)</w:t>
-            </w:r>
-          </w:p>
-        </w:tc>
-      </w:tr>
-      <w:tr>
-        <w:tc>
-          <w:tcPr>
-            <w:tcW w:w="3794" w:type="dxa"/>
-          </w:tcPr>
-          <w:p>
-            <w:pPr>
-              <w:rPr>
-                <w:rFonts w:ascii="Consolas" w:hAnsi="Consolas"/>
-                <w:b/>
-                <w:bCs/>
-                <w:sz w:val="20"/>
-              </w:rPr>
-            </w:pPr>
-            <w:r>
-              <w:rPr>
-                <w:rFonts w:ascii="Consolas" w:hAnsi="Consolas"/>
-                <w:b/>
-                <w:bCs/>
-                <w:sz w:val="20"/>
-                <w:highlight w:val="yellow"/>
-              </w:rPr>
-              <w:t>python run_single_half.py</w:t>
-            </w:r>
-          </w:p>
-        </w:tc>
-        <w:tc>
-          <w:tcPr>
-            <w:tcW w:w="5062" w:type="dxa"/>
-          </w:tcPr>
-          <w:p>
-            <w:r>
-              <w:t>Run half a block (12 cycles)</w:t>
-            </w:r>
-            <w:r>
-              <w:t>; in case of crashes</w:t>
             </w:r>
           </w:p>
         </w:tc>
@@ -976,439 +660,47 @@
     <w:p/>
     <w:p>
       <w:r>
-        <w:br w:type="page"/>
+        <w:t xml:space="preserve"> </w:t>
       </w:r>
     </w:p>
     <w:p>
       <w:r>
-        <w:lastRenderedPageBreak/>
-        <w:t>Thresholding</w:t>
+        <w:t>In Leipzig:</w:t>
       </w:r>
     </w:p>
     <w:p>
       <w:r>
-        <w:t xml:space="preserve">In MATLAB, check whether </w:t>
+        <w:t>Open a terminal</w:t>
+      </w:r>
+    </w:p>
+    <w:p>
+      <w:r>
+        <w:t xml:space="preserve">Activate </w:t>
       </w:r>
       <w:proofErr w:type="spellStart"/>
       <w:r>
-        <w:t>PsychToolbox</w:t>
+        <w:t>psychopy</w:t>
       </w:r>
       <w:proofErr w:type="spellEnd"/>
       <w:r>
-        <w:t xml:space="preserve"> is installed by typing</w:t>
+        <w:t xml:space="preserve"> environment by typing: PSYCHOPY</w:t>
+      </w:r>
+      <w:r>
+        <w:t xml:space="preserve"> (and then typing spyder)</w:t>
       </w:r>
     </w:p>
     <w:p>
-      <w:pPr>
-        <w:pStyle w:val="ListParagraph"/>
-        <w:numPr>
-          <w:ilvl w:val="0"/>
-          <w:numId w:val="10"/>
-        </w:numPr>
-      </w:pPr>
-      <w:proofErr w:type="spellStart"/>
       <w:r>
-        <w:t>PsychtoolboxVersion</w:t>
-      </w:r>
-      <w:proofErr w:type="spellEnd"/>
-      <w:r>
-        <w:t xml:space="preserve">   </w:t>
+        <w:t>Navigate to folder: /NOBACKUP2/USER/Francesca/Pilot_160626/fMRI_triangular_wave/thermal</w:t>
       </w:r>
     </w:p>
     <w:p>
-      <w:pPr>
-        <w:tabs>
-          <w:tab w:val="left" w:pos="560"/>
-          <w:tab w:val="left" w:pos="1120"/>
-          <w:tab w:val="left" w:pos="1680"/>
-          <w:tab w:val="left" w:pos="2240"/>
-          <w:tab w:val="left" w:pos="2800"/>
-          <w:tab w:val="left" w:pos="3360"/>
-          <w:tab w:val="left" w:pos="3920"/>
-          <w:tab w:val="left" w:pos="4480"/>
-          <w:tab w:val="left" w:pos="5040"/>
-          <w:tab w:val="left" w:pos="5600"/>
-          <w:tab w:val="left" w:pos="6160"/>
-          <w:tab w:val="left" w:pos="6720"/>
-        </w:tabs>
-        <w:autoSpaceDE w:val="0"/>
-        <w:autoSpaceDN w:val="0"/>
-        <w:adjustRightInd w:val="0"/>
-        <w:spacing w:after="0" w:line="240" w:lineRule="auto"/>
-      </w:pPr>
-      <w:r>
-        <w:t>If it’s not installed, follow the instructions below</w:t>
-      </w:r>
-    </w:p>
-    <w:p>
-      <w:pPr>
-        <w:tabs>
-          <w:tab w:val="left" w:pos="560"/>
-          <w:tab w:val="left" w:pos="1120"/>
-          <w:tab w:val="left" w:pos="1680"/>
-          <w:tab w:val="left" w:pos="2240"/>
-          <w:tab w:val="left" w:pos="2800"/>
-          <w:tab w:val="left" w:pos="3360"/>
-          <w:tab w:val="left" w:pos="3920"/>
-          <w:tab w:val="left" w:pos="4480"/>
-          <w:tab w:val="left" w:pos="5040"/>
-          <w:tab w:val="left" w:pos="5600"/>
-          <w:tab w:val="left" w:pos="6160"/>
-          <w:tab w:val="left" w:pos="6720"/>
-        </w:tabs>
-        <w:autoSpaceDE w:val="0"/>
-        <w:autoSpaceDN w:val="0"/>
-        <w:adjustRightInd w:val="0"/>
-        <w:spacing w:after="0" w:line="240" w:lineRule="auto"/>
-      </w:pPr>
       <w:r>
         <w:br/>
+        <w:t>Use the commands above to run the experiment</w:t>
       </w:r>
       <w:r>
-        <w:rPr>
-          <w:rFonts w:ascii="Apple Color Emoji" w:hAnsi="Apple Color Emoji" w:cs="Apple Color Emoji"/>
-        </w:rPr>
-        <w:t>⏺</w:t>
-      </w:r>
-      <w:r>
-        <w:t xml:space="preserve"> In MATLAB, run:                                                                                                       </w:t>
-      </w:r>
-    </w:p>
-    <w:p>
-      <w:pPr>
-        <w:tabs>
-          <w:tab w:val="left" w:pos="560"/>
-          <w:tab w:val="left" w:pos="1120"/>
-          <w:tab w:val="left" w:pos="1680"/>
-          <w:tab w:val="left" w:pos="2240"/>
-          <w:tab w:val="left" w:pos="2800"/>
-          <w:tab w:val="left" w:pos="3360"/>
-          <w:tab w:val="left" w:pos="3920"/>
-          <w:tab w:val="left" w:pos="4480"/>
-          <w:tab w:val="left" w:pos="5040"/>
-          <w:tab w:val="left" w:pos="5600"/>
-          <w:tab w:val="left" w:pos="6160"/>
-          <w:tab w:val="left" w:pos="6720"/>
-        </w:tabs>
-        <w:autoSpaceDE w:val="0"/>
-        <w:autoSpaceDN w:val="0"/>
-        <w:adjustRightInd w:val="0"/>
-        <w:spacing w:after="0" w:line="240" w:lineRule="auto"/>
-      </w:pPr>
-      <w:r>
-        <w:t xml:space="preserve">                                         </w:t>
-      </w:r>
-    </w:p>
-    <w:p>
-      <w:pPr>
-        <w:tabs>
-          <w:tab w:val="left" w:pos="560"/>
-          <w:tab w:val="left" w:pos="1120"/>
-          <w:tab w:val="left" w:pos="1680"/>
-          <w:tab w:val="left" w:pos="2240"/>
-          <w:tab w:val="left" w:pos="2800"/>
-          <w:tab w:val="left" w:pos="3360"/>
-          <w:tab w:val="left" w:pos="3920"/>
-          <w:tab w:val="left" w:pos="4480"/>
-          <w:tab w:val="left" w:pos="5040"/>
-          <w:tab w:val="left" w:pos="5600"/>
-          <w:tab w:val="left" w:pos="6160"/>
-          <w:tab w:val="left" w:pos="6720"/>
-        </w:tabs>
-        <w:autoSpaceDE w:val="0"/>
-        <w:autoSpaceDN w:val="0"/>
-        <w:adjustRightInd w:val="0"/>
-        <w:spacing w:after="0" w:line="240" w:lineRule="auto"/>
-      </w:pPr>
-      <w:r>
-        <w:t xml:space="preserve">  cd(</w:t>
-      </w:r>
-      <w:proofErr w:type="spellStart"/>
-      <w:r>
-        <w:t>tempdir</w:t>
-      </w:r>
-      <w:proofErr w:type="spellEnd"/>
-      <w:r>
-        <w:t xml:space="preserve">);                                                                                                          </w:t>
-      </w:r>
-    </w:p>
-    <w:p>
-      <w:pPr>
-        <w:tabs>
-          <w:tab w:val="left" w:pos="560"/>
-          <w:tab w:val="left" w:pos="1120"/>
-          <w:tab w:val="left" w:pos="1680"/>
-          <w:tab w:val="left" w:pos="2240"/>
-          <w:tab w:val="left" w:pos="2800"/>
-          <w:tab w:val="left" w:pos="3360"/>
-          <w:tab w:val="left" w:pos="3920"/>
-          <w:tab w:val="left" w:pos="4480"/>
-          <w:tab w:val="left" w:pos="5040"/>
-          <w:tab w:val="left" w:pos="5600"/>
-          <w:tab w:val="left" w:pos="6160"/>
-          <w:tab w:val="left" w:pos="6720"/>
-        </w:tabs>
-        <w:autoSpaceDE w:val="0"/>
-        <w:autoSpaceDN w:val="0"/>
-        <w:adjustRightInd w:val="0"/>
-        <w:spacing w:after="0" w:line="240" w:lineRule="auto"/>
-      </w:pPr>
-      <w:r>
-        <w:t xml:space="preserve">  </w:t>
-      </w:r>
-      <w:proofErr w:type="gramStart"/>
-      <w:r>
-        <w:t>urlwrite(</w:t>
-      </w:r>
-      <w:proofErr w:type="gramEnd"/>
-      <w:r>
-        <w:t>'https://raw.githubusercontent.com/Psychtoolbox-3/Psychtoolbox-3/master/Psychtoolbox/DownloadPsychtoolbox.m',</w:t>
-      </w:r>
-    </w:p>
-    <w:p>
-      <w:pPr>
-        <w:tabs>
-          <w:tab w:val="left" w:pos="560"/>
-          <w:tab w:val="left" w:pos="1120"/>
-          <w:tab w:val="left" w:pos="1680"/>
-          <w:tab w:val="left" w:pos="2240"/>
-          <w:tab w:val="left" w:pos="2800"/>
-          <w:tab w:val="left" w:pos="3360"/>
-          <w:tab w:val="left" w:pos="3920"/>
-          <w:tab w:val="left" w:pos="4480"/>
-          <w:tab w:val="left" w:pos="5040"/>
-          <w:tab w:val="left" w:pos="5600"/>
-          <w:tab w:val="left" w:pos="6160"/>
-          <w:tab w:val="left" w:pos="6720"/>
-        </w:tabs>
-        <w:autoSpaceDE w:val="0"/>
-        <w:autoSpaceDN w:val="0"/>
-        <w:adjustRightInd w:val="0"/>
-        <w:spacing w:after="0" w:line="240" w:lineRule="auto"/>
-      </w:pPr>
-      <w:r>
-        <w:t xml:space="preserve">   '</w:t>
-      </w:r>
-      <w:proofErr w:type="spellStart"/>
-      <w:r>
-        <w:t>DownloadPsychtoolbox.m</w:t>
-      </w:r>
-      <w:proofErr w:type="spellEnd"/>
-      <w:r>
-        <w:t xml:space="preserve">'); </w:t>
-      </w:r>
-      <w:proofErr w:type="spellStart"/>
-      <w:proofErr w:type="gramStart"/>
-      <w:r>
-        <w:t>DownloadPsychtoolbox</w:t>
-      </w:r>
-      <w:proofErr w:type="spellEnd"/>
-      <w:r>
-        <w:t>(</w:t>
-      </w:r>
-      <w:proofErr w:type="spellStart"/>
-      <w:r>
-        <w:t>fullfile</w:t>
-      </w:r>
-      <w:proofErr w:type="spellEnd"/>
-      <w:r>
-        <w:t>(</w:t>
-      </w:r>
-      <w:proofErr w:type="spellStart"/>
-      <w:proofErr w:type="gramEnd"/>
-      <w:r>
-        <w:t>userpath</w:t>
-      </w:r>
-      <w:proofErr w:type="spellEnd"/>
-      <w:r>
-        <w:t>, '</w:t>
-      </w:r>
-      <w:proofErr w:type="spellStart"/>
-      <w:r>
-        <w:t>Psychtoolbox</w:t>
-      </w:r>
-      <w:proofErr w:type="spellEnd"/>
-      <w:r>
-        <w:t xml:space="preserve">'))                                  </w:t>
-      </w:r>
-    </w:p>
-    <w:p>
-      <w:pPr>
-        <w:tabs>
-          <w:tab w:val="left" w:pos="560"/>
-          <w:tab w:val="left" w:pos="1120"/>
-          <w:tab w:val="left" w:pos="1680"/>
-          <w:tab w:val="left" w:pos="2240"/>
-          <w:tab w:val="left" w:pos="2800"/>
-          <w:tab w:val="left" w:pos="3360"/>
-          <w:tab w:val="left" w:pos="3920"/>
-          <w:tab w:val="left" w:pos="4480"/>
-          <w:tab w:val="left" w:pos="5040"/>
-          <w:tab w:val="left" w:pos="5600"/>
-          <w:tab w:val="left" w:pos="6160"/>
-          <w:tab w:val="left" w:pos="6720"/>
-        </w:tabs>
-        <w:autoSpaceDE w:val="0"/>
-        <w:autoSpaceDN w:val="0"/>
-        <w:adjustRightInd w:val="0"/>
-        <w:spacing w:after="0" w:line="240" w:lineRule="auto"/>
-      </w:pPr>
-      <w:r>
-        <w:t xml:space="preserve">                                                                                                                        </w:t>
-      </w:r>
-    </w:p>
-    <w:p>
-      <w:pPr>
-        <w:tabs>
-          <w:tab w:val="left" w:pos="560"/>
-          <w:tab w:val="left" w:pos="1120"/>
-          <w:tab w:val="left" w:pos="1680"/>
-          <w:tab w:val="left" w:pos="2240"/>
-          <w:tab w:val="left" w:pos="2800"/>
-          <w:tab w:val="left" w:pos="3360"/>
-          <w:tab w:val="left" w:pos="3920"/>
-          <w:tab w:val="left" w:pos="4480"/>
-          <w:tab w:val="left" w:pos="5040"/>
-          <w:tab w:val="left" w:pos="5600"/>
-          <w:tab w:val="left" w:pos="6160"/>
-          <w:tab w:val="left" w:pos="6720"/>
-        </w:tabs>
-        <w:autoSpaceDE w:val="0"/>
-        <w:autoSpaceDN w:val="0"/>
-        <w:adjustRightInd w:val="0"/>
-        <w:spacing w:after="0" w:line="240" w:lineRule="auto"/>
-      </w:pPr>
-      <w:r>
-        <w:t xml:space="preserve">  This downloads and installs </w:t>
-      </w:r>
-      <w:proofErr w:type="spellStart"/>
-      <w:r>
-        <w:t>Psychtoolbox</w:t>
-      </w:r>
-      <w:proofErr w:type="spellEnd"/>
-      <w:r>
-        <w:t xml:space="preserve"> into your MATLAB </w:t>
-      </w:r>
-      <w:proofErr w:type="spellStart"/>
-      <w:r>
-        <w:t>userpath</w:t>
-      </w:r>
-      <w:proofErr w:type="spellEnd"/>
-      <w:r>
-        <w:t>. Follow any prompts that appear.</w:t>
-      </w:r>
-    </w:p>
-    <w:p>
-      <w:pPr>
-        <w:tabs>
-          <w:tab w:val="left" w:pos="560"/>
-          <w:tab w:val="left" w:pos="1120"/>
-          <w:tab w:val="left" w:pos="1680"/>
-          <w:tab w:val="left" w:pos="2240"/>
-          <w:tab w:val="left" w:pos="2800"/>
-          <w:tab w:val="left" w:pos="3360"/>
-          <w:tab w:val="left" w:pos="3920"/>
-          <w:tab w:val="left" w:pos="4480"/>
-          <w:tab w:val="left" w:pos="5040"/>
-          <w:tab w:val="left" w:pos="5600"/>
-          <w:tab w:val="left" w:pos="6160"/>
-          <w:tab w:val="left" w:pos="6720"/>
-        </w:tabs>
-        <w:autoSpaceDE w:val="0"/>
-        <w:autoSpaceDN w:val="0"/>
-        <w:adjustRightInd w:val="0"/>
-        <w:spacing w:after="0" w:line="240" w:lineRule="auto"/>
-      </w:pPr>
-    </w:p>
-    <w:p>
-      <w:pPr>
-        <w:tabs>
-          <w:tab w:val="left" w:pos="560"/>
-          <w:tab w:val="left" w:pos="1120"/>
-          <w:tab w:val="left" w:pos="1680"/>
-          <w:tab w:val="left" w:pos="2240"/>
-          <w:tab w:val="left" w:pos="2800"/>
-          <w:tab w:val="left" w:pos="3360"/>
-          <w:tab w:val="left" w:pos="3920"/>
-          <w:tab w:val="left" w:pos="4480"/>
-          <w:tab w:val="left" w:pos="5040"/>
-          <w:tab w:val="left" w:pos="5600"/>
-          <w:tab w:val="left" w:pos="6160"/>
-          <w:tab w:val="left" w:pos="6720"/>
-        </w:tabs>
-        <w:autoSpaceDE w:val="0"/>
-        <w:autoSpaceDN w:val="0"/>
-        <w:adjustRightInd w:val="0"/>
-        <w:spacing w:after="0" w:line="240" w:lineRule="auto"/>
-      </w:pPr>
-      <w:r>
-        <w:t xml:space="preserve">  Prerequisites (macOS):                                                                                                </w:t>
-      </w:r>
-    </w:p>
-    <w:p>
-      <w:pPr>
-        <w:tabs>
-          <w:tab w:val="left" w:pos="560"/>
-          <w:tab w:val="left" w:pos="1120"/>
-          <w:tab w:val="left" w:pos="1680"/>
-          <w:tab w:val="left" w:pos="2240"/>
-          <w:tab w:val="left" w:pos="2800"/>
-          <w:tab w:val="left" w:pos="3360"/>
-          <w:tab w:val="left" w:pos="3920"/>
-          <w:tab w:val="left" w:pos="4480"/>
-          <w:tab w:val="left" w:pos="5040"/>
-          <w:tab w:val="left" w:pos="5600"/>
-          <w:tab w:val="left" w:pos="6160"/>
-          <w:tab w:val="left" w:pos="6720"/>
-        </w:tabs>
-        <w:autoSpaceDE w:val="0"/>
-        <w:autoSpaceDN w:val="0"/>
-        <w:adjustRightInd w:val="0"/>
-        <w:spacing w:after="0" w:line="240" w:lineRule="auto"/>
-      </w:pPr>
-      <w:r>
-        <w:t xml:space="preserve">  - Xcode Command Line Tools: </w:t>
-      </w:r>
-      <w:proofErr w:type="spellStart"/>
-      <w:r>
-        <w:t>xcode</w:t>
-      </w:r>
-      <w:proofErr w:type="spellEnd"/>
-      <w:r>
-        <w:t>-select --install</w:t>
-      </w:r>
-    </w:p>
-    <w:p>
-      <w:pPr>
-        <w:tabs>
-          <w:tab w:val="left" w:pos="560"/>
-          <w:tab w:val="left" w:pos="1120"/>
-          <w:tab w:val="left" w:pos="1680"/>
-          <w:tab w:val="left" w:pos="2240"/>
-          <w:tab w:val="left" w:pos="2800"/>
-          <w:tab w:val="left" w:pos="3360"/>
-          <w:tab w:val="left" w:pos="3920"/>
-          <w:tab w:val="left" w:pos="4480"/>
-          <w:tab w:val="left" w:pos="5040"/>
-          <w:tab w:val="left" w:pos="5600"/>
-          <w:tab w:val="left" w:pos="6160"/>
-          <w:tab w:val="left" w:pos="6720"/>
-        </w:tabs>
-        <w:autoSpaceDE w:val="0"/>
-        <w:autoSpaceDN w:val="0"/>
-        <w:adjustRightInd w:val="0"/>
-        <w:spacing w:after="0" w:line="240" w:lineRule="auto"/>
-      </w:pPr>
-      <w:r>
-        <w:t xml:space="preserve">  - </w:t>
-      </w:r>
-      <w:proofErr w:type="spellStart"/>
-      <w:r>
-        <w:t>GStreamer</w:t>
-      </w:r>
-      <w:proofErr w:type="spellEnd"/>
-      <w:r>
-        <w:t xml:space="preserve"> (for audio/video): download from https://gstreamer.freedesktop.org/download/   </w:t>
+        <w:t xml:space="preserve"> directly from the terminal (or within spyder)</w:t>
       </w:r>
     </w:p>
     <w:sectPr>

</xml_diff>